<commit_message>
:books: docs: alteracao listar fornecedor
</commit_message>
<xml_diff>
--- a/Documentation/WORD/Sprint04_Task059_listarfornecedor.docx
+++ b/Documentation/WORD/Sprint04_Task059_listarfornecedor.docx
@@ -1,6 +1,6 @@
 
 <file path=word/document.xml><?xml version="1.0" encoding="utf-8"?>
-<w:document xmlns:wpc="http://schemas.microsoft.com/office/word/2010/wordprocessingCanvas" xmlns:mc="http://schemas.openxmlformats.org/markup-compatibility/2006" xmlns:o="urn:schemas-microsoft-com:office:office" xmlns:r="http://schemas.openxmlformats.org/officeDocument/2006/relationships" xmlns:m="http://schemas.openxmlformats.org/officeDocument/2006/math" xmlns:v="urn:schemas-microsoft-com:vml" xmlns:wp14="http://schemas.microsoft.com/office/word/2010/wordprocessingDrawing" xmlns:wp="http://schemas.openxmlformats.org/drawingml/2006/wordprocessingDrawing" xmlns:w="http://schemas.openxmlformats.org/wordprocessingml/2006/main" xmlns:w14="http://schemas.microsoft.com/office/word/2010/wordml" xmlns:w10="urn:schemas-microsoft-com:office:word" xmlns:w15="http://schemas.microsoft.com/office/word/2012/wordml" xmlns:wpg="http://schemas.microsoft.com/office/word/2010/wordprocessingGroup" xmlns:wpi="http://schemas.microsoft.com/office/word/2010/wordprocessingInk" xmlns:wne="http://schemas.microsoft.com/office/word/2006/wordml" xmlns:wps="http://schemas.microsoft.com/office/word/2010/wordprocessingShape" xmlns:wpsCustomData="http://www.wps.cn/officeDocument/2013/wpsCustomData" mc:Ignorable="w14 w15 wp14">
+<w:document xmlns:wpc="http://schemas.microsoft.com/office/word/2010/wordprocessingCanvas" xmlns:cx="http://schemas.microsoft.com/office/drawing/2014/chartex" xmlns:cx1="http://schemas.microsoft.com/office/drawing/2015/9/8/chartex" xmlns:cx2="http://schemas.microsoft.com/office/drawing/2015/10/21/chartex" xmlns:cx3="http://schemas.microsoft.com/office/drawing/2016/5/9/chartex" xmlns:cx4="http://schemas.microsoft.com/office/drawing/2016/5/10/chartex" xmlns:cx5="http://schemas.microsoft.com/office/drawing/2016/5/11/chartex" xmlns:cx6="http://schemas.microsoft.com/office/drawing/2016/5/12/chartex" xmlns:cx7="http://schemas.microsoft.com/office/drawing/2016/5/13/chartex" xmlns:cx8="http://schemas.microsoft.com/office/drawing/2016/5/14/chartex" xmlns:mc="http://schemas.openxmlformats.org/markup-compatibility/2006" xmlns:aink="http://schemas.microsoft.com/office/drawing/2016/ink" xmlns:am3d="http://schemas.microsoft.com/office/drawing/2017/model3d" xmlns:o="urn:schemas-microsoft-com:office:office" xmlns:r="http://schemas.openxmlformats.org/officeDocument/2006/relationships" xmlns:m="http://schemas.openxmlformats.org/officeDocument/2006/math" xmlns:v="urn:schemas-microsoft-com:vml" xmlns:wp14="http://schemas.microsoft.com/office/word/2010/wordprocessingDrawing" xmlns:wp="http://schemas.openxmlformats.org/drawingml/2006/wordprocessingDrawing" xmlns:w10="urn:schemas-microsoft-com:office:word" xmlns:w="http://schemas.openxmlformats.org/wordprocessingml/2006/main" xmlns:w14="http://schemas.microsoft.com/office/word/2010/wordml" xmlns:w15="http://schemas.microsoft.com/office/word/2012/wordml" xmlns:w16cid="http://schemas.microsoft.com/office/word/2016/wordml/cid" xmlns:w16se="http://schemas.microsoft.com/office/word/2015/wordml/symex" xmlns:wpg="http://schemas.microsoft.com/office/word/2010/wordprocessingGroup" xmlns:wpi="http://schemas.microsoft.com/office/word/2010/wordprocessingInk" xmlns:wne="http://schemas.microsoft.com/office/word/2006/wordml" xmlns:wps="http://schemas.microsoft.com/office/word/2010/wordprocessingShape" mc:Ignorable="w14 w15 w16se w16cid wp14">
   <w:body>
     <w:p>
       <w:pPr>
@@ -9,6 +9,7 @@
       <w:r>
         <w:rPr>
           <w:rFonts w:ascii="Arial" w:hAnsi="Arial" w:cs="Arial"/>
+          <w:noProof/>
           <w:snapToGrid w:val="0"/>
           <w:sz w:val="24"/>
         </w:rPr>
@@ -64,24 +65,9 @@
     </w:p>
     <w:tbl>
       <w:tblPr>
-        <w:tblStyle w:val="20"/>
+        <w:tblStyle w:val="Tabelacomgrade"/>
         <w:tblW w:w="10201" w:type="dxa"/>
-        <w:tblInd w:w="0" w:type="dxa"/>
-        <w:tblBorders>
-          <w:top w:val="single" w:color="auto" w:sz="4" w:space="0"/>
-          <w:left w:val="single" w:color="auto" w:sz="4" w:space="0"/>
-          <w:bottom w:val="single" w:color="auto" w:sz="4" w:space="0"/>
-          <w:right w:val="single" w:color="auto" w:sz="4" w:space="0"/>
-          <w:insideH w:val="single" w:color="auto" w:sz="4" w:space="0"/>
-          <w:insideV w:val="single" w:color="auto" w:sz="4" w:space="0"/>
-        </w:tblBorders>
-        <w:tblLayout w:type="autofit"/>
-        <w:tblCellMar>
-          <w:top w:w="0" w:type="dxa"/>
-          <w:left w:w="108" w:type="dxa"/>
-          <w:bottom w:w="0" w:type="dxa"/>
-          <w:right w:w="108" w:type="dxa"/>
-        </w:tblCellMar>
+        <w:tblLook w:val="04A0" w:firstRow="1" w:lastRow="0" w:firstColumn="1" w:lastColumn="0" w:noHBand="0" w:noVBand="1"/>
       </w:tblPr>
       <w:tblGrid>
         <w:gridCol w:w="2831"/>
@@ -90,22 +76,6 @@
         <w:gridCol w:w="18"/>
       </w:tblGrid>
       <w:tr>
-        <w:tblPrEx>
-          <w:tblBorders>
-            <w:top w:val="single" w:color="auto" w:sz="4" w:space="0"/>
-            <w:left w:val="single" w:color="auto" w:sz="4" w:space="0"/>
-            <w:bottom w:val="single" w:color="auto" w:sz="4" w:space="0"/>
-            <w:right w:val="single" w:color="auto" w:sz="4" w:space="0"/>
-            <w:insideH w:val="single" w:color="auto" w:sz="4" w:space="0"/>
-            <w:insideV w:val="single" w:color="auto" w:sz="4" w:space="0"/>
-          </w:tblBorders>
-          <w:tblCellMar>
-            <w:top w:w="0" w:type="dxa"/>
-            <w:left w:w="108" w:type="dxa"/>
-            <w:bottom w:w="0" w:type="dxa"/>
-            <w:right w:w="108" w:type="dxa"/>
-          </w:tblCellMar>
-        </w:tblPrEx>
         <w:trPr>
           <w:gridAfter w:val="1"/>
           <w:wAfter w:w="18" w:type="dxa"/>
@@ -134,34 +104,25 @@
                 <w:color w:val="FFFFFF" w:themeColor="background1"/>
                 <w:sz w:val="28"/>
                 <w:szCs w:val="28"/>
-                <w14:textFill>
-                  <w14:solidFill>
-                    <w14:schemeClr w14:val="bg1"/>
-                  </w14:solidFill>
-                </w14:textFill>
-              </w:rPr>
-              <w:t>Sprint Documentation</w:t>
-            </w:r>
+              </w:rPr>
+              <w:t xml:space="preserve">Sprint </w:t>
+            </w:r>
+            <w:proofErr w:type="spellStart"/>
+            <w:r>
+              <w:rPr>
+                <w:b/>
+                <w:bCs/>
+                <w:color w:val="FFFFFF" w:themeColor="background1"/>
+                <w:sz w:val="28"/>
+                <w:szCs w:val="28"/>
+              </w:rPr>
+              <w:t>Documentation</w:t>
+            </w:r>
+            <w:proofErr w:type="spellEnd"/>
           </w:p>
         </w:tc>
       </w:tr>
       <w:tr>
-        <w:tblPrEx>
-          <w:tblBorders>
-            <w:top w:val="single" w:color="auto" w:sz="4" w:space="0"/>
-            <w:left w:val="single" w:color="auto" w:sz="4" w:space="0"/>
-            <w:bottom w:val="single" w:color="auto" w:sz="4" w:space="0"/>
-            <w:right w:val="single" w:color="auto" w:sz="4" w:space="0"/>
-            <w:insideH w:val="single" w:color="auto" w:sz="4" w:space="0"/>
-            <w:insideV w:val="single" w:color="auto" w:sz="4" w:space="0"/>
-          </w:tblBorders>
-          <w:tblCellMar>
-            <w:top w:w="0" w:type="dxa"/>
-            <w:left w:w="108" w:type="dxa"/>
-            <w:bottom w:w="0" w:type="dxa"/>
-            <w:right w:w="108" w:type="dxa"/>
-          </w:tblCellMar>
-        </w:tblPrEx>
         <w:tc>
           <w:tcPr>
             <w:tcW w:w="2831" w:type="dxa"/>
@@ -228,22 +189,6 @@
         </w:tc>
       </w:tr>
       <w:tr>
-        <w:tblPrEx>
-          <w:tblBorders>
-            <w:top w:val="single" w:color="auto" w:sz="4" w:space="0"/>
-            <w:left w:val="single" w:color="auto" w:sz="4" w:space="0"/>
-            <w:bottom w:val="single" w:color="auto" w:sz="4" w:space="0"/>
-            <w:right w:val="single" w:color="auto" w:sz="4" w:space="0"/>
-            <w:insideH w:val="single" w:color="auto" w:sz="4" w:space="0"/>
-            <w:insideV w:val="single" w:color="auto" w:sz="4" w:space="0"/>
-          </w:tblBorders>
-          <w:tblCellMar>
-            <w:top w:w="0" w:type="dxa"/>
-            <w:left w:w="108" w:type="dxa"/>
-            <w:bottom w:w="0" w:type="dxa"/>
-            <w:right w:w="108" w:type="dxa"/>
-          </w:tblCellMar>
-        </w:tblPrEx>
         <w:tc>
           <w:tcPr>
             <w:tcW w:w="2831" w:type="dxa"/>
@@ -256,12 +201,37 @@
                 <w:bCs/>
               </w:rPr>
             </w:pPr>
-            <w:r>
-              <w:rPr>
-                <w:b/>
-                <w:bCs/>
-              </w:rPr>
-              <w:t>Projetc Name:</w:t>
+            <w:proofErr w:type="spellStart"/>
+            <w:r>
+              <w:rPr>
+                <w:b/>
+                <w:bCs/>
+              </w:rPr>
+              <w:t>Projetc</w:t>
+            </w:r>
+            <w:proofErr w:type="spellEnd"/>
+            <w:r>
+              <w:rPr>
+                <w:b/>
+                <w:bCs/>
+              </w:rPr>
+              <w:t xml:space="preserve"> </w:t>
+            </w:r>
+            <w:proofErr w:type="spellStart"/>
+            <w:r>
+              <w:rPr>
+                <w:b/>
+                <w:bCs/>
+              </w:rPr>
+              <w:t>Name</w:t>
+            </w:r>
+            <w:proofErr w:type="spellEnd"/>
+            <w:r>
+              <w:rPr>
+                <w:b/>
+                <w:bCs/>
+              </w:rPr>
+              <w:t>:</w:t>
             </w:r>
           </w:p>
         </w:tc>
@@ -278,6 +248,7 @@
                 <w:bCs/>
               </w:rPr>
             </w:pPr>
+            <w:proofErr w:type="spellStart"/>
             <w:r>
               <w:rPr>
                 <w:b/>
@@ -285,26 +256,11 @@
               </w:rPr>
               <w:t>civitas-frontend</w:t>
             </w:r>
+            <w:proofErr w:type="spellEnd"/>
           </w:p>
         </w:tc>
       </w:tr>
       <w:tr>
-        <w:tblPrEx>
-          <w:tblBorders>
-            <w:top w:val="single" w:color="auto" w:sz="4" w:space="0"/>
-            <w:left w:val="single" w:color="auto" w:sz="4" w:space="0"/>
-            <w:bottom w:val="single" w:color="auto" w:sz="4" w:space="0"/>
-            <w:right w:val="single" w:color="auto" w:sz="4" w:space="0"/>
-            <w:insideH w:val="single" w:color="auto" w:sz="4" w:space="0"/>
-            <w:insideV w:val="single" w:color="auto" w:sz="4" w:space="0"/>
-          </w:tblBorders>
-          <w:tblCellMar>
-            <w:top w:w="0" w:type="dxa"/>
-            <w:left w:w="108" w:type="dxa"/>
-            <w:bottom w:w="0" w:type="dxa"/>
-            <w:right w:w="108" w:type="dxa"/>
-          </w:tblCellMar>
-        </w:tblPrEx>
         <w:tc>
           <w:tcPr>
             <w:tcW w:w="2831" w:type="dxa"/>
@@ -350,22 +306,6 @@
         </w:tc>
       </w:tr>
       <w:tr>
-        <w:tblPrEx>
-          <w:tblBorders>
-            <w:top w:val="single" w:color="auto" w:sz="4" w:space="0"/>
-            <w:left w:val="single" w:color="auto" w:sz="4" w:space="0"/>
-            <w:bottom w:val="single" w:color="auto" w:sz="4" w:space="0"/>
-            <w:right w:val="single" w:color="auto" w:sz="4" w:space="0"/>
-            <w:insideH w:val="single" w:color="auto" w:sz="4" w:space="0"/>
-            <w:insideV w:val="single" w:color="auto" w:sz="4" w:space="0"/>
-          </w:tblBorders>
-          <w:tblCellMar>
-            <w:top w:w="0" w:type="dxa"/>
-            <w:left w:w="108" w:type="dxa"/>
-            <w:bottom w:w="0" w:type="dxa"/>
-            <w:right w:w="108" w:type="dxa"/>
-          </w:tblCellMar>
-        </w:tblPrEx>
         <w:tc>
           <w:tcPr>
             <w:tcW w:w="10201" w:type="dxa"/>
@@ -386,34 +326,23 @@
                 <w:b/>
                 <w:bCs/>
                 <w:color w:val="FFFFFF" w:themeColor="background1"/>
-                <w14:textFill>
-                  <w14:solidFill>
-                    <w14:schemeClr w14:val="bg1"/>
-                  </w14:solidFill>
-                </w14:textFill>
-              </w:rPr>
-              <w:t>Team Members</w:t>
-            </w:r>
+              </w:rPr>
+              <w:t xml:space="preserve">Team </w:t>
+            </w:r>
+            <w:proofErr w:type="spellStart"/>
+            <w:r>
+              <w:rPr>
+                <w:b/>
+                <w:bCs/>
+                <w:color w:val="FFFFFF" w:themeColor="background1"/>
+              </w:rPr>
+              <w:t>Members</w:t>
+            </w:r>
+            <w:proofErr w:type="spellEnd"/>
           </w:p>
         </w:tc>
       </w:tr>
       <w:tr>
-        <w:tblPrEx>
-          <w:tblBorders>
-            <w:top w:val="single" w:color="auto" w:sz="4" w:space="0"/>
-            <w:left w:val="single" w:color="auto" w:sz="4" w:space="0"/>
-            <w:bottom w:val="single" w:color="auto" w:sz="4" w:space="0"/>
-            <w:right w:val="single" w:color="auto" w:sz="4" w:space="0"/>
-            <w:insideH w:val="single" w:color="auto" w:sz="4" w:space="0"/>
-            <w:insideV w:val="single" w:color="auto" w:sz="4" w:space="0"/>
-          </w:tblBorders>
-          <w:tblCellMar>
-            <w:top w:w="0" w:type="dxa"/>
-            <w:left w:w="108" w:type="dxa"/>
-            <w:bottom w:w="0" w:type="dxa"/>
-            <w:right w:w="108" w:type="dxa"/>
-          </w:tblCellMar>
-        </w:tblPrEx>
         <w:tc>
           <w:tcPr>
             <w:tcW w:w="10201" w:type="dxa"/>
@@ -430,22 +359,6 @@
         </w:tc>
       </w:tr>
       <w:tr>
-        <w:tblPrEx>
-          <w:tblBorders>
-            <w:top w:val="single" w:color="auto" w:sz="4" w:space="0"/>
-            <w:left w:val="single" w:color="auto" w:sz="4" w:space="0"/>
-            <w:bottom w:val="single" w:color="auto" w:sz="4" w:space="0"/>
-            <w:right w:val="single" w:color="auto" w:sz="4" w:space="0"/>
-            <w:insideH w:val="single" w:color="auto" w:sz="4" w:space="0"/>
-            <w:insideV w:val="single" w:color="auto" w:sz="4" w:space="0"/>
-          </w:tblBorders>
-          <w:tblCellMar>
-            <w:top w:w="0" w:type="dxa"/>
-            <w:left w:w="108" w:type="dxa"/>
-            <w:bottom w:w="0" w:type="dxa"/>
-            <w:right w:w="108" w:type="dxa"/>
-          </w:tblCellMar>
-        </w:tblPrEx>
         <w:tc>
           <w:tcPr>
             <w:tcW w:w="10201" w:type="dxa"/>
@@ -459,22 +372,6 @@
         </w:tc>
       </w:tr>
       <w:tr>
-        <w:tblPrEx>
-          <w:tblBorders>
-            <w:top w:val="single" w:color="auto" w:sz="4" w:space="0"/>
-            <w:left w:val="single" w:color="auto" w:sz="4" w:space="0"/>
-            <w:bottom w:val="single" w:color="auto" w:sz="4" w:space="0"/>
-            <w:right w:val="single" w:color="auto" w:sz="4" w:space="0"/>
-            <w:insideH w:val="single" w:color="auto" w:sz="4" w:space="0"/>
-            <w:insideV w:val="single" w:color="auto" w:sz="4" w:space="0"/>
-          </w:tblBorders>
-          <w:tblCellMar>
-            <w:top w:w="0" w:type="dxa"/>
-            <w:left w:w="108" w:type="dxa"/>
-            <w:bottom w:w="0" w:type="dxa"/>
-            <w:right w:w="108" w:type="dxa"/>
-          </w:tblCellMar>
-        </w:tblPrEx>
         <w:tc>
           <w:tcPr>
             <w:tcW w:w="10201" w:type="dxa"/>
@@ -488,22 +385,6 @@
         </w:tc>
       </w:tr>
       <w:tr>
-        <w:tblPrEx>
-          <w:tblBorders>
-            <w:top w:val="single" w:color="auto" w:sz="4" w:space="0"/>
-            <w:left w:val="single" w:color="auto" w:sz="4" w:space="0"/>
-            <w:bottom w:val="single" w:color="auto" w:sz="4" w:space="0"/>
-            <w:right w:val="single" w:color="auto" w:sz="4" w:space="0"/>
-            <w:insideH w:val="single" w:color="auto" w:sz="4" w:space="0"/>
-            <w:insideV w:val="single" w:color="auto" w:sz="4" w:space="0"/>
-          </w:tblBorders>
-          <w:tblCellMar>
-            <w:top w:w="0" w:type="dxa"/>
-            <w:left w:w="108" w:type="dxa"/>
-            <w:bottom w:w="0" w:type="dxa"/>
-            <w:right w:w="108" w:type="dxa"/>
-          </w:tblCellMar>
-        </w:tblPrEx>
         <w:tc>
           <w:tcPr>
             <w:tcW w:w="10201" w:type="dxa"/>
@@ -517,22 +398,6 @@
         </w:tc>
       </w:tr>
       <w:tr>
-        <w:tblPrEx>
-          <w:tblBorders>
-            <w:top w:val="single" w:color="auto" w:sz="4" w:space="0"/>
-            <w:left w:val="single" w:color="auto" w:sz="4" w:space="0"/>
-            <w:bottom w:val="single" w:color="auto" w:sz="4" w:space="0"/>
-            <w:right w:val="single" w:color="auto" w:sz="4" w:space="0"/>
-            <w:insideH w:val="single" w:color="auto" w:sz="4" w:space="0"/>
-            <w:insideV w:val="single" w:color="auto" w:sz="4" w:space="0"/>
-          </w:tblBorders>
-          <w:tblCellMar>
-            <w:top w:w="0" w:type="dxa"/>
-            <w:left w:w="108" w:type="dxa"/>
-            <w:bottom w:w="0" w:type="dxa"/>
-            <w:right w:w="108" w:type="dxa"/>
-          </w:tblCellMar>
-        </w:tblPrEx>
         <w:tc>
           <w:tcPr>
             <w:tcW w:w="10201" w:type="dxa"/>
@@ -549,48 +414,17 @@
     <w:p/>
     <w:tbl>
       <w:tblPr>
-        <w:tblStyle w:val="20"/>
+        <w:tblStyle w:val="Tabelacomgrade"/>
         <w:tblW w:w="10201" w:type="dxa"/>
-        <w:tblInd w:w="0" w:type="dxa"/>
-        <w:tblBorders>
-          <w:top w:val="single" w:color="auto" w:sz="4" w:space="0"/>
-          <w:left w:val="single" w:color="auto" w:sz="4" w:space="0"/>
-          <w:bottom w:val="single" w:color="auto" w:sz="4" w:space="0"/>
-          <w:right w:val="single" w:color="auto" w:sz="4" w:space="0"/>
-          <w:insideH w:val="single" w:color="auto" w:sz="4" w:space="0"/>
-          <w:insideV w:val="single" w:color="auto" w:sz="4" w:space="0"/>
-        </w:tblBorders>
-        <w:tblLayout w:type="autofit"/>
-        <w:tblCellMar>
-          <w:top w:w="0" w:type="dxa"/>
-          <w:left w:w="108" w:type="dxa"/>
-          <w:bottom w:w="0" w:type="dxa"/>
-          <w:right w:w="108" w:type="dxa"/>
-        </w:tblCellMar>
+        <w:tblLook w:val="04A0" w:firstRow="1" w:lastRow="0" w:firstColumn="1" w:lastColumn="0" w:noHBand="0" w:noVBand="1"/>
       </w:tblPr>
       <w:tblGrid>
-        <w:gridCol w:w="892"/>
-        <w:gridCol w:w="5799"/>
-        <w:gridCol w:w="1755"/>
-        <w:gridCol w:w="1755"/>
+        <w:gridCol w:w="767"/>
+        <w:gridCol w:w="6223"/>
+        <w:gridCol w:w="1540"/>
+        <w:gridCol w:w="1671"/>
       </w:tblGrid>
       <w:tr>
-        <w:tblPrEx>
-          <w:tblBorders>
-            <w:top w:val="single" w:color="auto" w:sz="4" w:space="0"/>
-            <w:left w:val="single" w:color="auto" w:sz="4" w:space="0"/>
-            <w:bottom w:val="single" w:color="auto" w:sz="4" w:space="0"/>
-            <w:right w:val="single" w:color="auto" w:sz="4" w:space="0"/>
-            <w:insideH w:val="single" w:color="auto" w:sz="4" w:space="0"/>
-            <w:insideV w:val="single" w:color="auto" w:sz="4" w:space="0"/>
-          </w:tblBorders>
-          <w:tblCellMar>
-            <w:top w:w="0" w:type="dxa"/>
-            <w:left w:w="108" w:type="dxa"/>
-            <w:bottom w:w="0" w:type="dxa"/>
-            <w:right w:w="108" w:type="dxa"/>
-          </w:tblCellMar>
-        </w:tblPrEx>
         <w:tc>
           <w:tcPr>
             <w:tcW w:w="10201" w:type="dxa"/>
@@ -617,22 +451,6 @@
         </w:tc>
       </w:tr>
       <w:tr>
-        <w:tblPrEx>
-          <w:tblBorders>
-            <w:top w:val="single" w:color="auto" w:sz="4" w:space="0"/>
-            <w:left w:val="single" w:color="auto" w:sz="4" w:space="0"/>
-            <w:bottom w:val="single" w:color="auto" w:sz="4" w:space="0"/>
-            <w:right w:val="single" w:color="auto" w:sz="4" w:space="0"/>
-            <w:insideH w:val="single" w:color="auto" w:sz="4" w:space="0"/>
-            <w:insideV w:val="single" w:color="auto" w:sz="4" w:space="0"/>
-          </w:tblBorders>
-          <w:tblCellMar>
-            <w:top w:w="0" w:type="dxa"/>
-            <w:left w:w="108" w:type="dxa"/>
-            <w:bottom w:w="0" w:type="dxa"/>
-            <w:right w:w="108" w:type="dxa"/>
-          </w:tblCellMar>
-        </w:tblPrEx>
         <w:tc>
           <w:tcPr>
             <w:tcW w:w="754" w:type="dxa"/>
@@ -641,8 +459,13 @@
             <w:pPr>
               <w:spacing w:after="0" w:line="240" w:lineRule="auto"/>
             </w:pPr>
-            <w:r>
-              <w:t>Task#</w:t>
+            <w:proofErr w:type="spellStart"/>
+            <w:r>
+              <w:t>Task</w:t>
+            </w:r>
+            <w:proofErr w:type="spellEnd"/>
+            <w:r>
+              <w:t>#</w:t>
             </w:r>
           </w:p>
         </w:tc>
@@ -654,9 +477,11 @@
             <w:pPr>
               <w:spacing w:after="0" w:line="240" w:lineRule="auto"/>
             </w:pPr>
+            <w:proofErr w:type="spellStart"/>
             <w:r>
               <w:t>Description</w:t>
             </w:r>
+            <w:proofErr w:type="spellEnd"/>
           </w:p>
         </w:tc>
         <w:tc>
@@ -667,9 +492,11 @@
             <w:pPr>
               <w:spacing w:after="0" w:line="240" w:lineRule="auto"/>
             </w:pPr>
+            <w:proofErr w:type="gramStart"/>
             <w:r>
               <w:t>Start Date</w:t>
             </w:r>
+            <w:proofErr w:type="gramEnd"/>
           </w:p>
         </w:tc>
         <w:tc>
@@ -687,22 +514,6 @@
         </w:tc>
       </w:tr>
       <w:tr>
-        <w:tblPrEx>
-          <w:tblBorders>
-            <w:top w:val="single" w:color="auto" w:sz="4" w:space="0"/>
-            <w:left w:val="single" w:color="auto" w:sz="4" w:space="0"/>
-            <w:bottom w:val="single" w:color="auto" w:sz="4" w:space="0"/>
-            <w:right w:val="single" w:color="auto" w:sz="4" w:space="0"/>
-            <w:insideH w:val="single" w:color="auto" w:sz="4" w:space="0"/>
-            <w:insideV w:val="single" w:color="auto" w:sz="4" w:space="0"/>
-          </w:tblBorders>
-          <w:tblCellMar>
-            <w:top w:w="0" w:type="dxa"/>
-            <w:left w:w="108" w:type="dxa"/>
-            <w:bottom w:w="0" w:type="dxa"/>
-            <w:right w:w="108" w:type="dxa"/>
-          </w:tblCellMar>
-        </w:tblPrEx>
         <w:tc>
           <w:tcPr>
             <w:tcW w:w="754" w:type="dxa"/>
@@ -727,12 +538,42 @@
                 <w:lang w:val="en-US"/>
               </w:rPr>
             </w:pPr>
+            <w:proofErr w:type="spellStart"/>
             <w:r>
               <w:rPr>
                 <w:lang w:val="en-US"/>
               </w:rPr>
-              <w:t>Criar protótipo UX/UI LISTAR fornecedor</w:t>
-            </w:r>
+              <w:t>Criar</w:t>
+            </w:r>
+            <w:proofErr w:type="spellEnd"/>
+            <w:r>
+              <w:rPr>
+                <w:lang w:val="en-US"/>
+              </w:rPr>
+              <w:t xml:space="preserve"> </w:t>
+            </w:r>
+            <w:proofErr w:type="spellStart"/>
+            <w:r>
+              <w:rPr>
+                <w:lang w:val="en-US"/>
+              </w:rPr>
+              <w:t>protótipo</w:t>
+            </w:r>
+            <w:proofErr w:type="spellEnd"/>
+            <w:r>
+              <w:rPr>
+                <w:lang w:val="en-US"/>
+              </w:rPr>
+              <w:t xml:space="preserve"> UX/UI LISTAR </w:t>
+            </w:r>
+            <w:proofErr w:type="spellStart"/>
+            <w:r>
+              <w:rPr>
+                <w:lang w:val="en-US"/>
+              </w:rPr>
+              <w:t>fornecedor</w:t>
+            </w:r>
+            <w:proofErr w:type="spellEnd"/>
           </w:p>
         </w:tc>
         <w:tc>
@@ -744,7 +585,16 @@
               <w:spacing w:after="0" w:line="240" w:lineRule="auto"/>
             </w:pPr>
             <w:r>
-              <w:t>21/10/2025</w:t>
+              <w:t>04</w:t>
+            </w:r>
+            <w:r>
+              <w:t>/1</w:t>
+            </w:r>
+            <w:r>
+              <w:t>1</w:t>
+            </w:r>
+            <w:r>
+              <w:t>/2025</w:t>
             </w:r>
           </w:p>
         </w:tc>
@@ -757,28 +607,20 @@
               <w:spacing w:after="0" w:line="240" w:lineRule="auto"/>
             </w:pPr>
             <w:r>
-              <w:t>03/11/2025</w:t>
+              <w:t>0</w:t>
+            </w:r>
+            <w:r>
+              <w:t>7</w:t>
+            </w:r>
+            <w:bookmarkStart w:id="0" w:name="_GoBack"/>
+            <w:bookmarkEnd w:id="0"/>
+            <w:r>
+              <w:t>/11/2025</w:t>
             </w:r>
           </w:p>
         </w:tc>
       </w:tr>
       <w:tr>
-        <w:tblPrEx>
-          <w:tblBorders>
-            <w:top w:val="single" w:color="auto" w:sz="4" w:space="0"/>
-            <w:left w:val="single" w:color="auto" w:sz="4" w:space="0"/>
-            <w:bottom w:val="single" w:color="auto" w:sz="4" w:space="0"/>
-            <w:right w:val="single" w:color="auto" w:sz="4" w:space="0"/>
-            <w:insideH w:val="single" w:color="auto" w:sz="4" w:space="0"/>
-            <w:insideV w:val="single" w:color="auto" w:sz="4" w:space="0"/>
-          </w:tblBorders>
-          <w:tblCellMar>
-            <w:top w:w="0" w:type="dxa"/>
-            <w:left w:w="108" w:type="dxa"/>
-            <w:bottom w:w="0" w:type="dxa"/>
-            <w:right w:w="108" w:type="dxa"/>
-          </w:tblCellMar>
-        </w:tblPrEx>
         <w:tc>
           <w:tcPr>
             <w:tcW w:w="754" w:type="dxa"/>
@@ -821,22 +663,6 @@
         </w:tc>
       </w:tr>
       <w:tr>
-        <w:tblPrEx>
-          <w:tblBorders>
-            <w:top w:val="single" w:color="auto" w:sz="4" w:space="0"/>
-            <w:left w:val="single" w:color="auto" w:sz="4" w:space="0"/>
-            <w:bottom w:val="single" w:color="auto" w:sz="4" w:space="0"/>
-            <w:right w:val="single" w:color="auto" w:sz="4" w:space="0"/>
-            <w:insideH w:val="single" w:color="auto" w:sz="4" w:space="0"/>
-            <w:insideV w:val="single" w:color="auto" w:sz="4" w:space="0"/>
-          </w:tblBorders>
-          <w:tblCellMar>
-            <w:top w:w="0" w:type="dxa"/>
-            <w:left w:w="108" w:type="dxa"/>
-            <w:bottom w:w="0" w:type="dxa"/>
-            <w:right w:w="108" w:type="dxa"/>
-          </w:tblCellMar>
-        </w:tblPrEx>
         <w:tc>
           <w:tcPr>
             <w:tcW w:w="754" w:type="dxa"/>
@@ -879,22 +705,6 @@
         </w:tc>
       </w:tr>
       <w:tr>
-        <w:tblPrEx>
-          <w:tblBorders>
-            <w:top w:val="single" w:color="auto" w:sz="4" w:space="0"/>
-            <w:left w:val="single" w:color="auto" w:sz="4" w:space="0"/>
-            <w:bottom w:val="single" w:color="auto" w:sz="4" w:space="0"/>
-            <w:right w:val="single" w:color="auto" w:sz="4" w:space="0"/>
-            <w:insideH w:val="single" w:color="auto" w:sz="4" w:space="0"/>
-            <w:insideV w:val="single" w:color="auto" w:sz="4" w:space="0"/>
-          </w:tblBorders>
-          <w:tblCellMar>
-            <w:top w:w="0" w:type="dxa"/>
-            <w:left w:w="108" w:type="dxa"/>
-            <w:bottom w:w="0" w:type="dxa"/>
-            <w:right w:w="108" w:type="dxa"/>
-          </w:tblCellMar>
-        </w:tblPrEx>
         <w:tc>
           <w:tcPr>
             <w:tcW w:w="754" w:type="dxa"/>
@@ -940,24 +750,9 @@
     <w:p/>
     <w:tbl>
       <w:tblPr>
-        <w:tblStyle w:val="20"/>
+        <w:tblStyle w:val="Tabelacomgrade"/>
         <w:tblW w:w="0" w:type="auto"/>
-        <w:tblInd w:w="0" w:type="dxa"/>
-        <w:tblBorders>
-          <w:top w:val="single" w:color="auto" w:sz="4" w:space="0"/>
-          <w:left w:val="single" w:color="auto" w:sz="4" w:space="0"/>
-          <w:bottom w:val="single" w:color="auto" w:sz="4" w:space="0"/>
-          <w:right w:val="single" w:color="auto" w:sz="4" w:space="0"/>
-          <w:insideH w:val="single" w:color="auto" w:sz="4" w:space="0"/>
-          <w:insideV w:val="single" w:color="auto" w:sz="4" w:space="0"/>
-        </w:tblBorders>
-        <w:tblLayout w:type="autofit"/>
-        <w:tblCellMar>
-          <w:top w:w="0" w:type="dxa"/>
-          <w:left w:w="108" w:type="dxa"/>
-          <w:bottom w:w="0" w:type="dxa"/>
-          <w:right w:w="108" w:type="dxa"/>
-        </w:tblCellMar>
+        <w:tblLook w:val="04A0" w:firstRow="1" w:lastRow="0" w:firstColumn="1" w:lastColumn="0" w:noHBand="0" w:noVBand="1"/>
       </w:tblPr>
       <w:tblGrid>
         <w:gridCol w:w="828"/>
@@ -968,22 +763,6 @@
         <w:gridCol w:w="1683"/>
       </w:tblGrid>
       <w:tr>
-        <w:tblPrEx>
-          <w:tblBorders>
-            <w:top w:val="single" w:color="auto" w:sz="4" w:space="0"/>
-            <w:left w:val="single" w:color="auto" w:sz="4" w:space="0"/>
-            <w:bottom w:val="single" w:color="auto" w:sz="4" w:space="0"/>
-            <w:right w:val="single" w:color="auto" w:sz="4" w:space="0"/>
-            <w:insideH w:val="single" w:color="auto" w:sz="4" w:space="0"/>
-            <w:insideV w:val="single" w:color="auto" w:sz="4" w:space="0"/>
-          </w:tblBorders>
-          <w:tblCellMar>
-            <w:top w:w="0" w:type="dxa"/>
-            <w:left w:w="108" w:type="dxa"/>
-            <w:bottom w:w="0" w:type="dxa"/>
-            <w:right w:w="108" w:type="dxa"/>
-          </w:tblCellMar>
-        </w:tblPrEx>
         <w:tc>
           <w:tcPr>
             <w:tcW w:w="10183" w:type="dxa"/>
@@ -999,33 +778,35 @@
                 <w:bCs/>
               </w:rPr>
             </w:pPr>
-            <w:r>
-              <w:rPr>
-                <w:b/>
-                <w:bCs/>
-              </w:rPr>
-              <w:t>Task Description</w:t>
-            </w:r>
+            <w:proofErr w:type="spellStart"/>
+            <w:r>
+              <w:rPr>
+                <w:b/>
+                <w:bCs/>
+              </w:rPr>
+              <w:t>Task</w:t>
+            </w:r>
+            <w:proofErr w:type="spellEnd"/>
+            <w:r>
+              <w:rPr>
+                <w:b/>
+                <w:bCs/>
+              </w:rPr>
+              <w:t xml:space="preserve"> </w:t>
+            </w:r>
+            <w:proofErr w:type="spellStart"/>
+            <w:r>
+              <w:rPr>
+                <w:b/>
+                <w:bCs/>
+              </w:rPr>
+              <w:t>Description</w:t>
+            </w:r>
+            <w:proofErr w:type="spellEnd"/>
           </w:p>
         </w:tc>
       </w:tr>
       <w:tr>
-        <w:tblPrEx>
-          <w:tblBorders>
-            <w:top w:val="single" w:color="auto" w:sz="4" w:space="0"/>
-            <w:left w:val="single" w:color="auto" w:sz="4" w:space="0"/>
-            <w:bottom w:val="single" w:color="auto" w:sz="4" w:space="0"/>
-            <w:right w:val="single" w:color="auto" w:sz="4" w:space="0"/>
-            <w:insideH w:val="single" w:color="auto" w:sz="4" w:space="0"/>
-            <w:insideV w:val="single" w:color="auto" w:sz="4" w:space="0"/>
-          </w:tblBorders>
-          <w:tblCellMar>
-            <w:top w:w="0" w:type="dxa"/>
-            <w:left w:w="108" w:type="dxa"/>
-            <w:bottom w:w="0" w:type="dxa"/>
-            <w:right w:w="108" w:type="dxa"/>
-          </w:tblCellMar>
-        </w:tblPrEx>
         <w:tc>
           <w:tcPr>
             <w:tcW w:w="828" w:type="dxa"/>
@@ -1034,8 +815,13 @@
             <w:pPr>
               <w:spacing w:after="0" w:line="240" w:lineRule="auto"/>
             </w:pPr>
-            <w:r>
-              <w:t>Task #</w:t>
+            <w:proofErr w:type="spellStart"/>
+            <w:r>
+              <w:t>Task</w:t>
+            </w:r>
+            <w:proofErr w:type="spellEnd"/>
+            <w:r>
+              <w:t xml:space="preserve"> #</w:t>
             </w:r>
           </w:p>
         </w:tc>
@@ -1047,9 +833,11 @@
             <w:pPr>
               <w:spacing w:after="0" w:line="240" w:lineRule="auto"/>
             </w:pPr>
+            <w:proofErr w:type="spellStart"/>
             <w:r>
               <w:t>Description</w:t>
             </w:r>
+            <w:proofErr w:type="spellEnd"/>
           </w:p>
         </w:tc>
         <w:tc>
@@ -1060,9 +848,19 @@
             <w:pPr>
               <w:spacing w:after="0" w:line="240" w:lineRule="auto"/>
             </w:pPr>
-            <w:r>
-              <w:t>Assigned To</w:t>
-            </w:r>
+            <w:proofErr w:type="spellStart"/>
+            <w:r>
+              <w:t>Assigned</w:t>
+            </w:r>
+            <w:proofErr w:type="spellEnd"/>
+            <w:r>
+              <w:t xml:space="preserve"> </w:t>
+            </w:r>
+            <w:proofErr w:type="spellStart"/>
+            <w:r>
+              <w:t>To</w:t>
+            </w:r>
+            <w:proofErr w:type="spellEnd"/>
           </w:p>
         </w:tc>
         <w:tc>
@@ -1086,8 +884,13 @@
             <w:pPr>
               <w:spacing w:after="0" w:line="240" w:lineRule="auto"/>
             </w:pPr>
-            <w:r>
-              <w:t>Estimated Hours</w:t>
+            <w:proofErr w:type="spellStart"/>
+            <w:r>
+              <w:t>Estimated</w:t>
+            </w:r>
+            <w:proofErr w:type="spellEnd"/>
+            <w:r>
+              <w:t xml:space="preserve"> Hours</w:t>
             </w:r>
           </w:p>
         </w:tc>
@@ -1099,29 +902,18 @@
             <w:pPr>
               <w:spacing w:after="0" w:line="240" w:lineRule="auto"/>
             </w:pPr>
-            <w:r>
-              <w:t>Logged Hours</w:t>
+            <w:proofErr w:type="spellStart"/>
+            <w:r>
+              <w:t>Logged</w:t>
+            </w:r>
+            <w:proofErr w:type="spellEnd"/>
+            <w:r>
+              <w:t xml:space="preserve"> Hours</w:t>
             </w:r>
           </w:p>
         </w:tc>
       </w:tr>
       <w:tr>
-        <w:tblPrEx>
-          <w:tblBorders>
-            <w:top w:val="single" w:color="auto" w:sz="4" w:space="0"/>
-            <w:left w:val="single" w:color="auto" w:sz="4" w:space="0"/>
-            <w:bottom w:val="single" w:color="auto" w:sz="4" w:space="0"/>
-            <w:right w:val="single" w:color="auto" w:sz="4" w:space="0"/>
-            <w:insideH w:val="single" w:color="auto" w:sz="4" w:space="0"/>
-            <w:insideV w:val="single" w:color="auto" w:sz="4" w:space="0"/>
-          </w:tblBorders>
-          <w:tblCellMar>
-            <w:top w:w="0" w:type="dxa"/>
-            <w:left w:w="108" w:type="dxa"/>
-            <w:bottom w:w="0" w:type="dxa"/>
-            <w:right w:w="108" w:type="dxa"/>
-          </w:tblCellMar>
-        </w:tblPrEx>
         <w:tc>
           <w:tcPr>
             <w:tcW w:w="828" w:type="dxa"/>
@@ -1144,7 +936,10 @@
               <w:spacing w:after="0" w:line="240" w:lineRule="auto"/>
             </w:pPr>
             <w:r>
-              <w:t>O objetivo desta tarefa é desenvolver o protótipo de interface (UX/UI) da funcionalidade Listar Fornecedor, assegurando uma visualização clara, organizada e alinhada ao padrão visual e de usabilidade do restante do sistema.</w:t>
+              <w:t xml:space="preserve">O objetivo desta tarefa é desenvolver o </w:t>
+            </w:r>
+            <w:r>
+              <w:t>protótipo de interface (UX/UI) da funcionalidade Listar Fornecedor, assegurando uma visualização clara, organizada e alinhada ao padrão visual e de usabilidade do restante do sistema.</w:t>
             </w:r>
           </w:p>
         </w:tc>
@@ -1169,9 +964,11 @@
             <w:pPr>
               <w:spacing w:after="0" w:line="240" w:lineRule="auto"/>
             </w:pPr>
+            <w:proofErr w:type="spellStart"/>
             <w:r>
               <w:t>Finished</w:t>
             </w:r>
+            <w:proofErr w:type="spellEnd"/>
           </w:p>
         </w:tc>
         <w:tc>
@@ -1202,22 +999,6 @@
         </w:tc>
       </w:tr>
       <w:tr>
-        <w:tblPrEx>
-          <w:tblBorders>
-            <w:top w:val="single" w:color="auto" w:sz="4" w:space="0"/>
-            <w:left w:val="single" w:color="auto" w:sz="4" w:space="0"/>
-            <w:bottom w:val="single" w:color="auto" w:sz="4" w:space="0"/>
-            <w:right w:val="single" w:color="auto" w:sz="4" w:space="0"/>
-            <w:insideH w:val="single" w:color="auto" w:sz="4" w:space="0"/>
-            <w:insideV w:val="single" w:color="auto" w:sz="4" w:space="0"/>
-          </w:tblBorders>
-          <w:tblCellMar>
-            <w:top w:w="0" w:type="dxa"/>
-            <w:left w:w="108" w:type="dxa"/>
-            <w:bottom w:w="0" w:type="dxa"/>
-            <w:right w:w="108" w:type="dxa"/>
-          </w:tblCellMar>
-        </w:tblPrEx>
         <w:tc>
           <w:tcPr>
             <w:tcW w:w="828" w:type="dxa"/>
@@ -1280,22 +1061,6 @@
         </w:tc>
       </w:tr>
       <w:tr>
-        <w:tblPrEx>
-          <w:tblBorders>
-            <w:top w:val="single" w:color="auto" w:sz="4" w:space="0"/>
-            <w:left w:val="single" w:color="auto" w:sz="4" w:space="0"/>
-            <w:bottom w:val="single" w:color="auto" w:sz="4" w:space="0"/>
-            <w:right w:val="single" w:color="auto" w:sz="4" w:space="0"/>
-            <w:insideH w:val="single" w:color="auto" w:sz="4" w:space="0"/>
-            <w:insideV w:val="single" w:color="auto" w:sz="4" w:space="0"/>
-          </w:tblBorders>
-          <w:tblCellMar>
-            <w:top w:w="0" w:type="dxa"/>
-            <w:left w:w="108" w:type="dxa"/>
-            <w:bottom w:w="0" w:type="dxa"/>
-            <w:right w:w="108" w:type="dxa"/>
-          </w:tblCellMar>
-        </w:tblPrEx>
         <w:tc>
           <w:tcPr>
             <w:tcW w:w="828" w:type="dxa"/>
@@ -1369,11 +1134,6 @@
           <w:color w:val="FFFFFF" w:themeColor="background1"/>
           <w:sz w:val="24"/>
           <w:szCs w:val="24"/>
-          <w14:textFill>
-            <w14:solidFill>
-              <w14:schemeClr w14:val="bg1"/>
-            </w14:solidFill>
-          </w14:textFill>
         </w:rPr>
       </w:pPr>
       <w:r>
@@ -1383,14 +1143,21 @@
           <w:color w:val="FFFFFF" w:themeColor="background1"/>
           <w:sz w:val="24"/>
           <w:szCs w:val="24"/>
-          <w14:textFill>
-            <w14:solidFill>
-              <w14:schemeClr w14:val="bg1"/>
-            </w14:solidFill>
-          </w14:textFill>
-        </w:rPr>
-        <w:t>Sprint Description</w:t>
-      </w:r>
+        </w:rPr>
+        <w:t xml:space="preserve">Sprint </w:t>
+      </w:r>
+      <w:proofErr w:type="spellStart"/>
+      <w:r>
+        <w:rPr>
+          <w:b/>
+          <w:bCs/>
+          <w:color w:val="FFFFFF" w:themeColor="background1"/>
+          <w:sz w:val="24"/>
+          <w:szCs w:val="24"/>
+        </w:rPr>
+        <w:t>Description</w:t>
+      </w:r>
+      <w:proofErr w:type="spellEnd"/>
     </w:p>
     <w:p>
       <w:pPr>
@@ -1402,7 +1169,13 @@
         <w:rPr>
           <w:rFonts w:ascii="Segoe UI Emoji" w:hAnsi="Segoe UI Emoji" w:cs="Segoe UI Emoji"/>
         </w:rPr>
-        <w:t>📌 Tarefa: Sprint 4 - Design - Criar Protótipo UX/UI de Fornecedor</w:t>
+        <w:t>📌</w:t>
+      </w:r>
+      <w:r>
+        <w:rPr>
+          <w:rFonts w:ascii="Segoe UI Emoji" w:hAnsi="Segoe UI Emoji" w:cs="Segoe UI Emoji"/>
+        </w:rPr>
+        <w:t xml:space="preserve"> Tarefa: Sprint 4 - Design - Criar Protótipo UX/UI de Fornecedor</w:t>
       </w:r>
     </w:p>
     <w:p>
@@ -1411,12 +1184,20 @@
           <w:rFonts w:ascii="Segoe UI Emoji" w:hAnsi="Segoe UI Emoji" w:cs="Segoe UI Emoji"/>
         </w:rPr>
       </w:pPr>
-      <w:r>
-        <w:rPr>
-          <w:rFonts w:ascii="Segoe UI Emoji" w:hAnsi="Segoe UI Emoji" w:cs="Segoe UI Emoji"/>
-        </w:rPr>
-        <w:t>🎯 Objetivo</w:t>
-      </w:r>
+      <w:proofErr w:type="gramStart"/>
+      <w:r>
+        <w:rPr>
+          <w:rFonts w:ascii="Segoe UI Emoji" w:hAnsi="Segoe UI Emoji" w:cs="Segoe UI Emoji"/>
+        </w:rPr>
+        <w:t>🎯</w:t>
+      </w:r>
+      <w:r>
+        <w:rPr>
+          <w:rFonts w:ascii="Segoe UI Emoji" w:hAnsi="Segoe UI Emoji" w:cs="Segoe UI Emoji"/>
+        </w:rPr>
+        <w:t xml:space="preserve"> Objetivo</w:t>
+      </w:r>
+      <w:proofErr w:type="gramEnd"/>
     </w:p>
     <w:p>
       <w:pPr>
@@ -1428,7 +1209,21 @@
         <w:rPr>
           <w:rFonts w:ascii="Segoe UI Emoji" w:hAnsi="Segoe UI Emoji" w:cs="Segoe UI Emoji"/>
         </w:rPr>
-        <w:t>Desenvolver o protótipo UX/UI da tela de Fornecedor no Figma, garantindo uma interface clara, funcional e alinhada com o padrão visual do sistema.</w:t>
+        <w:t xml:space="preserve">Desenvolver o protótipo UX/UI da tela de Fornecedor no </w:t>
+      </w:r>
+      <w:proofErr w:type="spellStart"/>
+      <w:r>
+        <w:rPr>
+          <w:rFonts w:ascii="Segoe UI Emoji" w:hAnsi="Segoe UI Emoji" w:cs="Segoe UI Emoji"/>
+        </w:rPr>
+        <w:t>Figma</w:t>
+      </w:r>
+      <w:proofErr w:type="spellEnd"/>
+      <w:r>
+        <w:rPr>
+          <w:rFonts w:ascii="Segoe UI Emoji" w:hAnsi="Segoe UI Emoji" w:cs="Segoe UI Emoji"/>
+        </w:rPr>
+        <w:t>, garantindo uma interface clara, funcional e alinhada com o padrão visual do sistema.</w:t>
       </w:r>
     </w:p>
     <w:p>
@@ -1444,12 +1239,14 @@
           <w:rFonts w:ascii="Segoe UI Emoji" w:hAnsi="Segoe UI Emoji" w:cs="Segoe UI Emoji"/>
         </w:rPr>
       </w:pPr>
+      <w:proofErr w:type="spellStart"/>
       <w:r>
         <w:rPr>
           <w:rFonts w:ascii="Segoe UI Emoji" w:hAnsi="Segoe UI Emoji" w:cs="Segoe UI Emoji"/>
         </w:rPr>
         <w:t>Image</w:t>
       </w:r>
+      <w:proofErr w:type="spellEnd"/>
     </w:p>
     <w:p>
       <w:pPr>
@@ -1461,7 +1258,20 @@
         <w:rPr>
           <w:rFonts w:ascii="Segoe UI Emoji" w:hAnsi="Segoe UI Emoji" w:cs="Segoe UI Emoji"/>
         </w:rPr>
-        <w:t>✅ Critérios de Aceite</w:t>
+        <w:lastRenderedPageBreak/>
+        <w:t>✅</w:t>
+      </w:r>
+      <w:r>
+        <w:rPr>
+          <w:rFonts w:ascii="Segoe UI Emoji" w:hAnsi="Segoe UI Emoji" w:cs="Segoe UI Emoji"/>
+        </w:rPr>
+        <w:t xml:space="preserve"> Critérios</w:t>
+      </w:r>
+      <w:r>
+        <w:rPr>
+          <w:rFonts w:ascii="Segoe UI Emoji" w:hAnsi="Segoe UI Emoji" w:cs="Segoe UI Emoji"/>
+        </w:rPr>
+        <w:t xml:space="preserve"> de Aceite</w:t>
       </w:r>
     </w:p>
     <w:p>
@@ -1481,7 +1291,21 @@
         <w:rPr>
           <w:rFonts w:ascii="Segoe UI Emoji" w:hAnsi="Segoe UI Emoji" w:cs="Segoe UI Emoji"/>
         </w:rPr>
-        <w:t>Protótipo criado no Figma com uso da biblioteca de componentes</w:t>
+        <w:t xml:space="preserve">Protótipo criado no </w:t>
+      </w:r>
+      <w:proofErr w:type="spellStart"/>
+      <w:r>
+        <w:rPr>
+          <w:rFonts w:ascii="Segoe UI Emoji" w:hAnsi="Segoe UI Emoji" w:cs="Segoe UI Emoji"/>
+        </w:rPr>
+        <w:t>Figma</w:t>
+      </w:r>
+      <w:proofErr w:type="spellEnd"/>
+      <w:r>
+        <w:rPr>
+          <w:rFonts w:ascii="Segoe UI Emoji" w:hAnsi="Segoe UI Emoji" w:cs="Segoe UI Emoji"/>
+        </w:rPr>
+        <w:t xml:space="preserve"> com uso da biblioteca de componentes</w:t>
       </w:r>
     </w:p>
     <w:p>
@@ -1554,7 +1378,25 @@
         <w:rPr>
           <w:rFonts w:ascii="Segoe UI Emoji" w:hAnsi="Segoe UI Emoji" w:cs="Segoe UI Emoji"/>
         </w:rPr>
-        <w:t>🗒️ Observações</w:t>
+        <w:t>🗒</w:t>
+      </w:r>
+      <w:r>
+        <w:rPr>
+          <w:rFonts w:ascii="Segoe UI Emoji" w:hAnsi="Segoe UI Emoji" w:cs="Segoe UI Emoji"/>
+        </w:rPr>
+        <w:t>️</w:t>
+      </w:r>
+      <w:r>
+        <w:rPr>
+          <w:rFonts w:ascii="Segoe UI Emoji" w:hAnsi="Segoe UI Emoji" w:cs="Segoe UI Emoji"/>
+        </w:rPr>
+        <w:t xml:space="preserve"> Ob</w:t>
+      </w:r>
+      <w:r>
+        <w:rPr>
+          <w:rFonts w:ascii="Segoe UI Emoji" w:hAnsi="Segoe UI Emoji" w:cs="Segoe UI Emoji"/>
+        </w:rPr>
+        <w:t>servações</w:t>
       </w:r>
     </w:p>
     <w:p>
@@ -1586,50 +1428,19 @@
         <w:rPr>
           <w:rFonts w:ascii="Segoe UI Emoji" w:hAnsi="Segoe UI Emoji" w:cs="Segoe UI Emoji"/>
         </w:rPr>
-        <w:br w:type="textWrapping"/>
+        <w:br/>
       </w:r>
     </w:p>
     <w:tbl>
       <w:tblPr>
-        <w:tblStyle w:val="20"/>
+        <w:tblStyle w:val="Tabelacomgrade"/>
         <w:tblW w:w="0" w:type="auto"/>
-        <w:tblInd w:w="0" w:type="dxa"/>
-        <w:tblBorders>
-          <w:top w:val="single" w:color="auto" w:sz="4" w:space="0"/>
-          <w:left w:val="single" w:color="auto" w:sz="4" w:space="0"/>
-          <w:bottom w:val="single" w:color="auto" w:sz="4" w:space="0"/>
-          <w:right w:val="single" w:color="auto" w:sz="4" w:space="0"/>
-          <w:insideH w:val="single" w:color="auto" w:sz="4" w:space="0"/>
-          <w:insideV w:val="single" w:color="auto" w:sz="4" w:space="0"/>
-        </w:tblBorders>
-        <w:tblLayout w:type="autofit"/>
-        <w:tblCellMar>
-          <w:top w:w="0" w:type="dxa"/>
-          <w:left w:w="108" w:type="dxa"/>
-          <w:bottom w:w="0" w:type="dxa"/>
-          <w:right w:w="108" w:type="dxa"/>
-        </w:tblCellMar>
+        <w:tblLook w:val="04A0" w:firstRow="1" w:lastRow="0" w:firstColumn="1" w:lastColumn="0" w:noHBand="0" w:noVBand="1"/>
       </w:tblPr>
       <w:tblGrid>
         <w:gridCol w:w="10183"/>
       </w:tblGrid>
       <w:tr>
-        <w:tblPrEx>
-          <w:tblBorders>
-            <w:top w:val="single" w:color="auto" w:sz="4" w:space="0"/>
-            <w:left w:val="single" w:color="auto" w:sz="4" w:space="0"/>
-            <w:bottom w:val="single" w:color="auto" w:sz="4" w:space="0"/>
-            <w:right w:val="single" w:color="auto" w:sz="4" w:space="0"/>
-            <w:insideH w:val="single" w:color="auto" w:sz="4" w:space="0"/>
-            <w:insideV w:val="single" w:color="auto" w:sz="4" w:space="0"/>
-          </w:tblBorders>
-          <w:tblCellMar>
-            <w:top w:w="0" w:type="dxa"/>
-            <w:left w:w="108" w:type="dxa"/>
-            <w:bottom w:w="0" w:type="dxa"/>
-            <w:right w:w="108" w:type="dxa"/>
-          </w:tblCellMar>
-        </w:tblPrEx>
         <w:tc>
           <w:tcPr>
             <w:tcW w:w="10183" w:type="dxa"/>
@@ -1653,14 +1464,21 @@
                 <w:color w:val="FFFFFF" w:themeColor="background1"/>
                 <w:sz w:val="24"/>
                 <w:szCs w:val="24"/>
-                <w14:textFill>
-                  <w14:solidFill>
-                    <w14:schemeClr w14:val="bg1"/>
-                  </w14:solidFill>
-                </w14:textFill>
-              </w:rPr>
-              <w:t>Sprint Results</w:t>
-            </w:r>
+              </w:rPr>
+              <w:t xml:space="preserve">Sprint </w:t>
+            </w:r>
+            <w:proofErr w:type="spellStart"/>
+            <w:r>
+              <w:rPr>
+                <w:b/>
+                <w:bCs/>
+                <w:color w:val="FFFFFF" w:themeColor="background1"/>
+                <w:sz w:val="24"/>
+                <w:szCs w:val="24"/>
+              </w:rPr>
+              <w:t>Results</w:t>
+            </w:r>
+            <w:proofErr w:type="spellEnd"/>
           </w:p>
         </w:tc>
       </w:tr>
@@ -1668,9 +1486,33 @@
     <w:p/>
     <w:p>
       <w:r>
-        <w:t xml:space="preserve">Durante esta sprint foi desenvolvida a tela “Listagem de Fornecedores”, responsável por exibir, buscar e gerenciar os fornecedores cadastrados no sistema. Foram implementadas a tabela de listagem com colunas de ID, Nome Fantasia, Situação, CNPJ, Endereço, Contatos e Localização, além dos botões de ação para limpar, cadastrar e filtrar os resultados. A tela conta com uma barra de busca e filtros dinâmica, permitindo localizar fornecedores de forma rápida e eficiente. Também foi adicionado o breadcrumb “Home &gt; Instituições &gt; Listagem de Fornecedores” para facilitar a navegação, juntamente com o botão de voltar para retorno à tela anterior. O design responsivo segue a identidade visual do sistema, com cores, ícones e componentes reutilizáveis que mantêm a consistência da interface. Como resultado, a tela apresenta um layout limpo, moderno e intuitivo, garantindo uma gestão eficiente dos fornecedores e total alinhamento com o restante do sistema. </w:t>
-      </w:r>
-      <w:r>
+        <w:t xml:space="preserve">Durante esta sprint foi desenvolvida a tela “Listagem de Fornecedores”, responsável por exibir, buscar e gerenciar os fornecedores cadastrados no sistema. Foram implementadas a tabela de listagem com colunas de ID, Nome Fantasia, Situação, CNPJ, Endereço, </w:t>
+      </w:r>
+      <w:r>
+        <w:t xml:space="preserve">Contatos e Localização, além dos botões de ação para limpar, cadastrar e filtrar os resultados. A tela conta com uma barra de busca e filtros dinâmica, permitindo localizar fornecedores de forma rápida e eficiente. Também foi adicionado o </w:t>
+      </w:r>
+      <w:proofErr w:type="spellStart"/>
+      <w:r>
+        <w:t>breadcrumb</w:t>
+      </w:r>
+      <w:proofErr w:type="spellEnd"/>
+      <w:r>
+        <w:t xml:space="preserve"> “Home </w:t>
+      </w:r>
+      <w:r>
+        <w:t>&gt; Instituições &gt; Listagem de Fornecedores” para facilitar a navegação, juntamente com o botão de voltar para retorno à tela anterior. O design responsivo segue a identidade visual do sistema, com cores, ícones e componentes reutilizáveis que mantêm a consi</w:t>
+      </w:r>
+      <w:r>
+        <w:t xml:space="preserve">stência da interface. Como resultado, a tela apresenta um layout limpo, moderno e intuitivo, garantindo uma gestão eficiente dos </w:t>
+      </w:r>
+      <w:r>
+        <w:lastRenderedPageBreak/>
+        <w:t xml:space="preserve">fornecedores e total alinhamento com o restante do sistema. </w:t>
+      </w:r>
+      <w:r>
+        <w:rPr>
+          <w:noProof/>
+        </w:rPr>
         <w:drawing>
           <wp:inline distT="0" distB="0" distL="114300" distR="114300">
             <wp:extent cx="6324600" cy="4505325"/>
@@ -1713,8 +1555,6 @@
           </wp:inline>
         </w:drawing>
       </w:r>
-      <w:bookmarkStart w:id="0" w:name="_GoBack"/>
-      <w:bookmarkEnd w:id="0"/>
     </w:p>
     <w:p/>
     <w:p>
@@ -1729,11 +1569,6 @@
           <w:color w:val="FFFFFF" w:themeColor="background1"/>
           <w:sz w:val="24"/>
           <w:szCs w:val="24"/>
-          <w14:textFill>
-            <w14:solidFill>
-              <w14:schemeClr w14:val="bg1"/>
-            </w14:solidFill>
-          </w14:textFill>
         </w:rPr>
         <w:t>Assinaturas</w:t>
       </w:r>
@@ -1741,16 +1576,16 @@
     <w:sectPr>
       <w:pgSz w:w="11906" w:h="16838"/>
       <w:pgMar w:top="720" w:right="720" w:bottom="720" w:left="993" w:header="708" w:footer="708" w:gutter="0"/>
-      <w:cols w:space="708" w:num="1"/>
-      <w:docGrid w:linePitch="360" w:charSpace="0"/>
+      <w:cols w:space="708"/>
+      <w:docGrid w:linePitch="360"/>
     </w:sectPr>
   </w:body>
 </w:document>
 </file>
 
 <file path=word/endnotes.xml><?xml version="1.0" encoding="utf-8"?>
-<w:endnotes xmlns:wpc="http://schemas.microsoft.com/office/word/2010/wordprocessingCanvas" xmlns:mc="http://schemas.openxmlformats.org/markup-compatibility/2006" xmlns:o="urn:schemas-microsoft-com:office:office" xmlns:r="http://schemas.openxmlformats.org/officeDocument/2006/relationships" xmlns:m="http://schemas.openxmlformats.org/officeDocument/2006/math" xmlns:v="urn:schemas-microsoft-com:vml" xmlns:wp14="http://schemas.microsoft.com/office/word/2010/wordprocessingDrawing" xmlns:wp="http://schemas.openxmlformats.org/drawingml/2006/wordprocessingDrawing" xmlns:w="http://schemas.openxmlformats.org/wordprocessingml/2006/main" xmlns:w14="http://schemas.microsoft.com/office/word/2010/wordml" xmlns:w15="http://schemas.microsoft.com/office/word/2012/wordml" xmlns:w10="urn:schemas-microsoft-com:office:word" xmlns:wpg="http://schemas.microsoft.com/office/word/2010/wordprocessingGroup" xmlns:wpi="http://schemas.microsoft.com/office/word/2010/wordprocessingInk" xmlns:wne="http://schemas.microsoft.com/office/word/2006/wordml" xmlns:wps="http://schemas.microsoft.com/office/word/2010/wordprocessingShape" xmlns:wpsCustomData="http://www.wps.cn/officeDocument/2013/wpsCustomData" mc:Ignorable="w14 w15 wp14">
-  <w:endnote w:type="separator" w:id="0">
+<w:endnotes xmlns:wpc="http://schemas.microsoft.com/office/word/2010/wordprocessingCanvas" xmlns:cx="http://schemas.microsoft.com/office/drawing/2014/chartex" xmlns:cx1="http://schemas.microsoft.com/office/drawing/2015/9/8/chartex" xmlns:cx2="http://schemas.microsoft.com/office/drawing/2015/10/21/chartex" xmlns:cx3="http://schemas.microsoft.com/office/drawing/2016/5/9/chartex" xmlns:cx4="http://schemas.microsoft.com/office/drawing/2016/5/10/chartex" xmlns:cx5="http://schemas.microsoft.com/office/drawing/2016/5/11/chartex" xmlns:cx6="http://schemas.microsoft.com/office/drawing/2016/5/12/chartex" xmlns:cx7="http://schemas.microsoft.com/office/drawing/2016/5/13/chartex" xmlns:cx8="http://schemas.microsoft.com/office/drawing/2016/5/14/chartex" xmlns:mc="http://schemas.openxmlformats.org/markup-compatibility/2006" xmlns:aink="http://schemas.microsoft.com/office/drawing/2016/ink" xmlns:am3d="http://schemas.microsoft.com/office/drawing/2017/model3d" xmlns:o="urn:schemas-microsoft-com:office:office" xmlns:r="http://schemas.openxmlformats.org/officeDocument/2006/relationships" xmlns:m="http://schemas.openxmlformats.org/officeDocument/2006/math" xmlns:v="urn:schemas-microsoft-com:vml" xmlns:wp14="http://schemas.microsoft.com/office/word/2010/wordprocessingDrawing" xmlns:wp="http://schemas.openxmlformats.org/drawingml/2006/wordprocessingDrawing" xmlns:w10="urn:schemas-microsoft-com:office:word" xmlns:w="http://schemas.openxmlformats.org/wordprocessingml/2006/main" xmlns:w14="http://schemas.microsoft.com/office/word/2010/wordml" xmlns:w15="http://schemas.microsoft.com/office/word/2012/wordml" xmlns:w16cid="http://schemas.microsoft.com/office/word/2016/wordml/cid" xmlns:w16se="http://schemas.microsoft.com/office/word/2015/wordml/symex" xmlns:wpg="http://schemas.microsoft.com/office/word/2010/wordprocessingGroup" xmlns:wpi="http://schemas.microsoft.com/office/word/2010/wordprocessingInk" xmlns:wne="http://schemas.microsoft.com/office/word/2006/wordml" xmlns:wps="http://schemas.microsoft.com/office/word/2010/wordprocessingShape" mc:Ignorable="w14 w15 w16se w16cid wp14">
+  <w:endnote w:type="separator" w:id="-1">
     <w:p>
       <w:pPr>
         <w:spacing w:line="240" w:lineRule="auto"/>
@@ -1760,7 +1595,7 @@
       </w:r>
     </w:p>
   </w:endnote>
-  <w:endnote w:type="continuationSeparator" w:id="1">
+  <w:endnote w:type="continuationSeparator" w:id="0">
     <w:p>
       <w:pPr>
         <w:spacing w:line="240" w:lineRule="auto"/>
@@ -1774,21 +1609,21 @@
 </file>
 
 <file path=word/footnotes.xml><?xml version="1.0" encoding="utf-8"?>
-<w:footnotes xmlns:wpc="http://schemas.microsoft.com/office/word/2010/wordprocessingCanvas" xmlns:mc="http://schemas.openxmlformats.org/markup-compatibility/2006" xmlns:o="urn:schemas-microsoft-com:office:office" xmlns:r="http://schemas.openxmlformats.org/officeDocument/2006/relationships" xmlns:m="http://schemas.openxmlformats.org/officeDocument/2006/math" xmlns:v="urn:schemas-microsoft-com:vml" xmlns:wp14="http://schemas.microsoft.com/office/word/2010/wordprocessingDrawing" xmlns:wp="http://schemas.openxmlformats.org/drawingml/2006/wordprocessingDrawing" xmlns:w="http://schemas.openxmlformats.org/wordprocessingml/2006/main" xmlns:w14="http://schemas.microsoft.com/office/word/2010/wordml" xmlns:w15="http://schemas.microsoft.com/office/word/2012/wordml" xmlns:w10="urn:schemas-microsoft-com:office:word" xmlns:wpg="http://schemas.microsoft.com/office/word/2010/wordprocessingGroup" xmlns:wpi="http://schemas.microsoft.com/office/word/2010/wordprocessingInk" xmlns:wne="http://schemas.microsoft.com/office/word/2006/wordml" xmlns:wps="http://schemas.microsoft.com/office/word/2010/wordprocessingShape" xmlns:wpsCustomData="http://www.wps.cn/officeDocument/2013/wpsCustomData" mc:Ignorable="w14 w15 wp14">
-  <w:footnote w:type="separator" w:id="0">
+<w:footnotes xmlns:wpc="http://schemas.microsoft.com/office/word/2010/wordprocessingCanvas" xmlns:cx="http://schemas.microsoft.com/office/drawing/2014/chartex" xmlns:cx1="http://schemas.microsoft.com/office/drawing/2015/9/8/chartex" xmlns:cx2="http://schemas.microsoft.com/office/drawing/2015/10/21/chartex" xmlns:cx3="http://schemas.microsoft.com/office/drawing/2016/5/9/chartex" xmlns:cx4="http://schemas.microsoft.com/office/drawing/2016/5/10/chartex" xmlns:cx5="http://schemas.microsoft.com/office/drawing/2016/5/11/chartex" xmlns:cx6="http://schemas.microsoft.com/office/drawing/2016/5/12/chartex" xmlns:cx7="http://schemas.microsoft.com/office/drawing/2016/5/13/chartex" xmlns:cx8="http://schemas.microsoft.com/office/drawing/2016/5/14/chartex" xmlns:mc="http://schemas.openxmlformats.org/markup-compatibility/2006" xmlns:aink="http://schemas.microsoft.com/office/drawing/2016/ink" xmlns:am3d="http://schemas.microsoft.com/office/drawing/2017/model3d" xmlns:o="urn:schemas-microsoft-com:office:office" xmlns:r="http://schemas.openxmlformats.org/officeDocument/2006/relationships" xmlns:m="http://schemas.openxmlformats.org/officeDocument/2006/math" xmlns:v="urn:schemas-microsoft-com:vml" xmlns:wp14="http://schemas.microsoft.com/office/word/2010/wordprocessingDrawing" xmlns:wp="http://schemas.openxmlformats.org/drawingml/2006/wordprocessingDrawing" xmlns:w10="urn:schemas-microsoft-com:office:word" xmlns:w="http://schemas.openxmlformats.org/wordprocessingml/2006/main" xmlns:w14="http://schemas.microsoft.com/office/word/2010/wordml" xmlns:w15="http://schemas.microsoft.com/office/word/2012/wordml" xmlns:w16cid="http://schemas.microsoft.com/office/word/2016/wordml/cid" xmlns:w16se="http://schemas.microsoft.com/office/word/2015/wordml/symex" xmlns:wpg="http://schemas.microsoft.com/office/word/2010/wordprocessingGroup" xmlns:wpi="http://schemas.microsoft.com/office/word/2010/wordprocessingInk" xmlns:wne="http://schemas.microsoft.com/office/word/2006/wordml" xmlns:wps="http://schemas.microsoft.com/office/word/2010/wordprocessingShape" mc:Ignorable="w14 w15 w16se w16cid wp14">
+  <w:footnote w:type="separator" w:id="-1">
     <w:p>
       <w:pPr>
-        <w:spacing w:before="0" w:after="0" w:line="259" w:lineRule="auto"/>
+        <w:spacing w:after="0"/>
       </w:pPr>
       <w:r>
         <w:separator/>
       </w:r>
     </w:p>
   </w:footnote>
-  <w:footnote w:type="continuationSeparator" w:id="1">
+  <w:footnote w:type="continuationSeparator" w:id="0">
     <w:p>
       <w:pPr>
-        <w:spacing w:before="0" w:after="0" w:line="259" w:lineRule="auto"/>
+        <w:spacing w:after="0"/>
       </w:pPr>
       <w:r>
         <w:continuationSeparator/>
@@ -1799,193 +1634,413 @@
 </file>
 
 <file path=word/styles.xml><?xml version="1.0" encoding="utf-8"?>
-<w:styles xmlns:mc="http://schemas.openxmlformats.org/markup-compatibility/2006" xmlns:o="urn:schemas-microsoft-com:office:office" xmlns:r="http://schemas.openxmlformats.org/officeDocument/2006/relationships" xmlns:m="http://schemas.openxmlformats.org/officeDocument/2006/math" xmlns:v="urn:schemas-microsoft-com:vml" xmlns:w="http://schemas.openxmlformats.org/wordprocessingml/2006/main" xmlns:w14="http://schemas.microsoft.com/office/word/2010/wordml" xmlns:w10="urn:schemas-microsoft-com:office:word" xmlns:sl="http://schemas.openxmlformats.org/schemaLibrary/2006/main" xmlns:wpsCustomData="http://www.wps.cn/officeDocument/2013/wpsCustomData" mc:Ignorable="w14">
+<w:styles xmlns:mc="http://schemas.openxmlformats.org/markup-compatibility/2006" xmlns:r="http://schemas.openxmlformats.org/officeDocument/2006/relationships" xmlns:w="http://schemas.openxmlformats.org/wordprocessingml/2006/main" xmlns:w14="http://schemas.microsoft.com/office/word/2010/wordml" xmlns:w15="http://schemas.microsoft.com/office/word/2012/wordml" xmlns:w16cid="http://schemas.microsoft.com/office/word/2016/wordml/cid" xmlns:w16se="http://schemas.microsoft.com/office/word/2015/wordml/symex" mc:Ignorable="w14 w15 w16se w16cid">
   <w:docDefaults>
     <w:rPrDefault>
       <w:rPr>
-        <w:rFonts w:asciiTheme="minorHAnsi" w:hAnsiTheme="minorHAnsi" w:eastAsiaTheme="minorHAnsi" w:cstheme="minorBidi"/>
+        <w:rFonts w:asciiTheme="minorHAnsi" w:eastAsiaTheme="minorHAnsi" w:hAnsiTheme="minorHAnsi" w:cstheme="minorBidi"/>
+        <w:lang w:val="pt-BR" w:eastAsia="pt-BR" w:bidi="ar-SA"/>
       </w:rPr>
     </w:rPrDefault>
     <w:pPrDefault/>
   </w:docDefaults>
-  <w:latentStyles w:count="260" w:defQFormat="0" w:defUnhideWhenUsed="1" w:defSemiHidden="1" w:defUIPriority="99" w:defLockedState="0">
-    <w:lsdException w:qFormat="1" w:unhideWhenUsed="0" w:uiPriority="0" w:semiHidden="0" w:name="Normal"/>
-    <w:lsdException w:qFormat="1" w:unhideWhenUsed="0" w:uiPriority="9" w:semiHidden="0" w:name="heading 1"/>
-    <w:lsdException w:qFormat="1" w:uiPriority="9" w:name="heading 2"/>
-    <w:lsdException w:qFormat="1" w:uiPriority="9" w:name="heading 3"/>
-    <w:lsdException w:qFormat="1" w:uiPriority="9" w:name="heading 4"/>
-    <w:lsdException w:qFormat="1" w:uiPriority="9" w:name="heading 5"/>
-    <w:lsdException w:qFormat="1" w:uiPriority="9" w:name="heading 6"/>
-    <w:lsdException w:qFormat="1" w:uiPriority="9" w:name="heading 7"/>
-    <w:lsdException w:qFormat="1" w:uiPriority="9" w:name="heading 8"/>
-    <w:lsdException w:qFormat="1" w:uiPriority="9" w:name="heading 9"/>
-    <w:lsdException w:uiPriority="99" w:name="index 1"/>
-    <w:lsdException w:uiPriority="99" w:name="index 2"/>
-    <w:lsdException w:uiPriority="99" w:name="index 3"/>
-    <w:lsdException w:uiPriority="99" w:name="index 4"/>
-    <w:lsdException w:uiPriority="99" w:name="index 5"/>
-    <w:lsdException w:uiPriority="99" w:name="index 6"/>
-    <w:lsdException w:uiPriority="99" w:name="index 7"/>
-    <w:lsdException w:uiPriority="99" w:name="index 8"/>
-    <w:lsdException w:uiPriority="99" w:name="index 9"/>
-    <w:lsdException w:uiPriority="39" w:name="toc 1"/>
-    <w:lsdException w:uiPriority="39" w:name="toc 2"/>
-    <w:lsdException w:uiPriority="39" w:name="toc 3"/>
-    <w:lsdException w:uiPriority="39" w:name="toc 4"/>
-    <w:lsdException w:uiPriority="39" w:name="toc 5"/>
-    <w:lsdException w:uiPriority="39" w:name="toc 6"/>
-    <w:lsdException w:uiPriority="39" w:name="toc 7"/>
-    <w:lsdException w:uiPriority="39" w:name="toc 8"/>
-    <w:lsdException w:uiPriority="39" w:name="toc 9"/>
-    <w:lsdException w:uiPriority="99" w:name="Normal Indent"/>
-    <w:lsdException w:uiPriority="99" w:name="footnote text"/>
-    <w:lsdException w:uiPriority="99" w:name="annotation text"/>
-    <w:lsdException w:qFormat="1" w:uiPriority="99" w:semiHidden="0" w:name="header"/>
-    <w:lsdException w:qFormat="1" w:uiPriority="99" w:semiHidden="0" w:name="footer"/>
-    <w:lsdException w:uiPriority="99" w:name="index heading"/>
-    <w:lsdException w:qFormat="1" w:uiPriority="35" w:name="caption"/>
-    <w:lsdException w:uiPriority="99" w:name="table of figures"/>
-    <w:lsdException w:uiPriority="99" w:name="envelope address"/>
-    <w:lsdException w:uiPriority="99" w:name="envelope return"/>
-    <w:lsdException w:uiPriority="99" w:name="footnote reference"/>
-    <w:lsdException w:uiPriority="99" w:name="annotation reference"/>
-    <w:lsdException w:uiPriority="99" w:name="line number"/>
-    <w:lsdException w:uiPriority="99" w:name="page number"/>
-    <w:lsdException w:uiPriority="99" w:name="endnote reference"/>
-    <w:lsdException w:uiPriority="99" w:name="endnote text"/>
-    <w:lsdException w:uiPriority="99" w:name="table of authorities"/>
-    <w:lsdException w:uiPriority="99" w:name="macro"/>
-    <w:lsdException w:uiPriority="99" w:name="toa heading"/>
-    <w:lsdException w:uiPriority="99" w:name="List"/>
-    <w:lsdException w:uiPriority="99" w:name="List Bullet"/>
-    <w:lsdException w:uiPriority="99" w:name="List Number"/>
-    <w:lsdException w:uiPriority="99" w:name="List 2"/>
-    <w:lsdException w:uiPriority="99" w:name="List 3"/>
-    <w:lsdException w:uiPriority="99" w:name="List 4"/>
-    <w:lsdException w:uiPriority="99" w:name="List 5"/>
-    <w:lsdException w:uiPriority="99" w:name="List Bullet 2"/>
-    <w:lsdException w:uiPriority="99" w:name="List Bullet 3"/>
-    <w:lsdException w:uiPriority="99" w:name="List Bullet 4"/>
-    <w:lsdException w:uiPriority="99" w:name="List Bullet 5"/>
-    <w:lsdException w:uiPriority="99" w:name="List Number 2"/>
-    <w:lsdException w:uiPriority="99" w:name="List Number 3"/>
-    <w:lsdException w:uiPriority="99" w:name="List Number 4"/>
-    <w:lsdException w:uiPriority="99" w:name="List Number 5"/>
-    <w:lsdException w:qFormat="1" w:unhideWhenUsed="0" w:uiPriority="10" w:semiHidden="0" w:name="Title"/>
-    <w:lsdException w:uiPriority="99" w:name="Closing"/>
-    <w:lsdException w:uiPriority="99" w:name="Signature"/>
-    <w:lsdException w:uiPriority="1" w:name="Default Paragraph Font"/>
-    <w:lsdException w:uiPriority="99" w:name="Body Text"/>
-    <w:lsdException w:uiPriority="99" w:name="Body Text Indent"/>
-    <w:lsdException w:uiPriority="99" w:name="List Continue"/>
-    <w:lsdException w:uiPriority="99" w:name="List Continue 2"/>
-    <w:lsdException w:uiPriority="99" w:name="List Continue 3"/>
-    <w:lsdException w:uiPriority="99" w:name="List Continue 4"/>
-    <w:lsdException w:uiPriority="99" w:name="List Continue 5"/>
-    <w:lsdException w:uiPriority="99" w:name="Message Header"/>
-    <w:lsdException w:qFormat="1" w:unhideWhenUsed="0" w:uiPriority="11" w:semiHidden="0" w:name="Subtitle"/>
-    <w:lsdException w:uiPriority="99" w:name="Salutation"/>
-    <w:lsdException w:uiPriority="99" w:name="Date"/>
-    <w:lsdException w:uiPriority="99" w:name="Body Text First Indent"/>
-    <w:lsdException w:uiPriority="99" w:name="Body Text First Indent 2"/>
-    <w:lsdException w:uiPriority="99" w:name="Note Heading"/>
-    <w:lsdException w:uiPriority="99" w:name="Body Text 2"/>
-    <w:lsdException w:uiPriority="99" w:name="Body Text 3"/>
-    <w:lsdException w:uiPriority="99" w:name="Body Text Indent 2"/>
-    <w:lsdException w:uiPriority="99" w:name="Body Text Indent 3"/>
-    <w:lsdException w:uiPriority="99" w:name="Block Text"/>
-    <w:lsdException w:uiPriority="99" w:name="Hyperlink"/>
-    <w:lsdException w:uiPriority="99" w:name="FollowedHyperlink"/>
-    <w:lsdException w:qFormat="1" w:unhideWhenUsed="0" w:uiPriority="22" w:semiHidden="0" w:name="Strong"/>
-    <w:lsdException w:qFormat="1" w:unhideWhenUsed="0" w:uiPriority="20" w:semiHidden="0" w:name="Emphasis"/>
-    <w:lsdException w:uiPriority="99" w:name="Document Map"/>
-    <w:lsdException w:uiPriority="99" w:name="Plain Text"/>
-    <w:lsdException w:uiPriority="99" w:name="E-mail Signature"/>
-    <w:lsdException w:qFormat="1" w:uiPriority="99" w:name="Normal (Web)"/>
-    <w:lsdException w:uiPriority="99" w:name="HTML Acronym"/>
-    <w:lsdException w:uiPriority="99" w:name="HTML Address"/>
-    <w:lsdException w:uiPriority="99" w:name="HTML Cite"/>
-    <w:lsdException w:qFormat="1" w:uiPriority="99" w:name="HTML Code"/>
-    <w:lsdException w:uiPriority="99" w:name="HTML Definition"/>
-    <w:lsdException w:uiPriority="99" w:name="HTML Keyboard"/>
-    <w:lsdException w:uiPriority="99" w:name="HTML Preformatted"/>
-    <w:lsdException w:uiPriority="99" w:name="HTML Sample"/>
-    <w:lsdException w:uiPriority="99" w:name="HTML Typewriter"/>
-    <w:lsdException w:uiPriority="99" w:name="HTML Variable"/>
-    <w:lsdException w:qFormat="1" w:uiPriority="99" w:name="Normal Table"/>
-    <w:lsdException w:uiPriority="99" w:name="annotation subject"/>
-    <w:lsdException w:uiPriority="99" w:name="Table Simple 1"/>
-    <w:lsdException w:uiPriority="99" w:name="Table Simple 2"/>
-    <w:lsdException w:uiPriority="99" w:name="Table Simple 3"/>
-    <w:lsdException w:uiPriority="99" w:name="Table Classic 1"/>
-    <w:lsdException w:uiPriority="99" w:name="Table Classic 2"/>
-    <w:lsdException w:uiPriority="99" w:name="Table Classic 3"/>
-    <w:lsdException w:uiPriority="99" w:name="Table Classic 4"/>
-    <w:lsdException w:uiPriority="99" w:name="Table Colorful 1"/>
-    <w:lsdException w:uiPriority="99" w:name="Table Colorful 2"/>
-    <w:lsdException w:uiPriority="99" w:name="Table Colorful 3"/>
-    <w:lsdException w:uiPriority="99" w:name="Table Columns 1"/>
-    <w:lsdException w:uiPriority="99" w:name="Table Columns 2"/>
-    <w:lsdException w:uiPriority="99" w:name="Table Columns 3"/>
-    <w:lsdException w:uiPriority="99" w:name="Table Columns 4"/>
-    <w:lsdException w:uiPriority="99" w:name="Table Columns 5"/>
-    <w:lsdException w:uiPriority="99" w:name="Table Grid 1"/>
-    <w:lsdException w:uiPriority="99" w:name="Table Grid 2"/>
-    <w:lsdException w:uiPriority="99" w:name="Table Grid 3"/>
-    <w:lsdException w:uiPriority="99" w:name="Table Grid 4"/>
-    <w:lsdException w:uiPriority="99" w:name="Table Grid 5"/>
-    <w:lsdException w:uiPriority="99" w:name="Table Grid 6"/>
-    <w:lsdException w:uiPriority="99" w:name="Table Grid 7"/>
-    <w:lsdException w:uiPriority="99" w:name="Table Grid 8"/>
-    <w:lsdException w:uiPriority="99" w:name="Table List 1"/>
-    <w:lsdException w:uiPriority="99" w:name="Table List 2"/>
-    <w:lsdException w:uiPriority="99" w:name="Table List 3"/>
-    <w:lsdException w:uiPriority="99" w:name="Table List 4"/>
-    <w:lsdException w:uiPriority="99" w:name="Table List 5"/>
-    <w:lsdException w:uiPriority="99" w:name="Table List 6"/>
-    <w:lsdException w:uiPriority="99" w:name="Table List 7"/>
-    <w:lsdException w:uiPriority="99" w:name="Table List 8"/>
-    <w:lsdException w:uiPriority="99" w:name="Table 3D effects 1"/>
-    <w:lsdException w:uiPriority="99" w:name="Table 3D effects 2"/>
-    <w:lsdException w:uiPriority="99" w:name="Table 3D effects 3"/>
-    <w:lsdException w:uiPriority="99" w:name="Table Contemporary"/>
-    <w:lsdException w:uiPriority="99" w:name="Table Elegant"/>
-    <w:lsdException w:uiPriority="99" w:name="Table Professional"/>
-    <w:lsdException w:uiPriority="99" w:name="Table Subtle 1"/>
-    <w:lsdException w:uiPriority="99" w:name="Table Subtle 2"/>
-    <w:lsdException w:uiPriority="99" w:name="Table Web 1"/>
-    <w:lsdException w:uiPriority="99" w:name="Table Web 2"/>
-    <w:lsdException w:uiPriority="99" w:name="Table Web 3"/>
-    <w:lsdException w:uiPriority="99" w:name="Balloon Text"/>
-    <w:lsdException w:qFormat="1" w:unhideWhenUsed="0" w:uiPriority="39" w:semiHidden="0" w:name="Table Grid"/>
-    <w:lsdException w:uiPriority="99" w:name="Table Theme"/>
-    <w:lsdException w:qFormat="1" w:unhideWhenUsed="0" w:uiPriority="34" w:semiHidden="0" w:name="List Paragraph"/>
-    <w:lsdException w:qFormat="1" w:unhideWhenUsed="0" w:uiPriority="29" w:semiHidden="0" w:name="Quote"/>
-    <w:lsdException w:qFormat="1" w:unhideWhenUsed="0" w:uiPriority="30" w:semiHidden="0" w:name="Intense Quote"/>
+  <w:latentStyles w:defLockedState="0" w:defUIPriority="99" w:defSemiHidden="0" w:defUnhideWhenUsed="0" w:defQFormat="0" w:count="375">
+    <w:lsdException w:name="Normal" w:uiPriority="0" w:qFormat="1"/>
+    <w:lsdException w:name="heading 1" w:uiPriority="9" w:qFormat="1"/>
+    <w:lsdException w:name="heading 2" w:semiHidden="1" w:uiPriority="9" w:unhideWhenUsed="1" w:qFormat="1"/>
+    <w:lsdException w:name="heading 3" w:semiHidden="1" w:uiPriority="9" w:unhideWhenUsed="1" w:qFormat="1"/>
+    <w:lsdException w:name="heading 4" w:semiHidden="1" w:uiPriority="9" w:unhideWhenUsed="1" w:qFormat="1"/>
+    <w:lsdException w:name="heading 5" w:semiHidden="1" w:uiPriority="9" w:unhideWhenUsed="1" w:qFormat="1"/>
+    <w:lsdException w:name="heading 6" w:semiHidden="1" w:uiPriority="9" w:unhideWhenUsed="1" w:qFormat="1"/>
+    <w:lsdException w:name="heading 7" w:semiHidden="1" w:uiPriority="9" w:unhideWhenUsed="1" w:qFormat="1"/>
+    <w:lsdException w:name="heading 8" w:semiHidden="1" w:uiPriority="9" w:unhideWhenUsed="1" w:qFormat="1"/>
+    <w:lsdException w:name="heading 9" w:semiHidden="1" w:uiPriority="9" w:unhideWhenUsed="1" w:qFormat="1"/>
+    <w:lsdException w:name="index 1" w:semiHidden="1" w:unhideWhenUsed="1"/>
+    <w:lsdException w:name="index 2" w:semiHidden="1" w:unhideWhenUsed="1"/>
+    <w:lsdException w:name="index 3" w:semiHidden="1" w:unhideWhenUsed="1"/>
+    <w:lsdException w:name="index 4" w:semiHidden="1" w:unhideWhenUsed="1"/>
+    <w:lsdException w:name="index 5" w:semiHidden="1" w:unhideWhenUsed="1"/>
+    <w:lsdException w:name="index 6" w:semiHidden="1" w:unhideWhenUsed="1"/>
+    <w:lsdException w:name="index 7" w:semiHidden="1" w:unhideWhenUsed="1"/>
+    <w:lsdException w:name="index 8" w:semiHidden="1" w:unhideWhenUsed="1"/>
+    <w:lsdException w:name="index 9" w:semiHidden="1" w:unhideWhenUsed="1"/>
+    <w:lsdException w:name="toc 1" w:semiHidden="1" w:uiPriority="39" w:unhideWhenUsed="1"/>
+    <w:lsdException w:name="toc 2" w:semiHidden="1" w:uiPriority="39" w:unhideWhenUsed="1"/>
+    <w:lsdException w:name="toc 3" w:semiHidden="1" w:uiPriority="39" w:unhideWhenUsed="1"/>
+    <w:lsdException w:name="toc 4" w:semiHidden="1" w:uiPriority="39" w:unhideWhenUsed="1"/>
+    <w:lsdException w:name="toc 5" w:semiHidden="1" w:uiPriority="39" w:unhideWhenUsed="1"/>
+    <w:lsdException w:name="toc 6" w:semiHidden="1" w:uiPriority="39" w:unhideWhenUsed="1"/>
+    <w:lsdException w:name="toc 7" w:semiHidden="1" w:uiPriority="39" w:unhideWhenUsed="1"/>
+    <w:lsdException w:name="toc 8" w:semiHidden="1" w:uiPriority="39" w:unhideWhenUsed="1"/>
+    <w:lsdException w:name="toc 9" w:semiHidden="1" w:uiPriority="39" w:unhideWhenUsed="1"/>
+    <w:lsdException w:name="Normal Indent" w:semiHidden="1" w:unhideWhenUsed="1"/>
+    <w:lsdException w:name="footnote text" w:semiHidden="1" w:unhideWhenUsed="1"/>
+    <w:lsdException w:name="annotation text" w:semiHidden="1" w:unhideWhenUsed="1"/>
+    <w:lsdException w:name="header" w:unhideWhenUsed="1" w:qFormat="1"/>
+    <w:lsdException w:name="footer" w:unhideWhenUsed="1" w:qFormat="1"/>
+    <w:lsdException w:name="index heading" w:semiHidden="1" w:unhideWhenUsed="1"/>
+    <w:lsdException w:name="caption" w:semiHidden="1" w:uiPriority="35" w:unhideWhenUsed="1" w:qFormat="1"/>
+    <w:lsdException w:name="table of figures" w:semiHidden="1" w:unhideWhenUsed="1"/>
+    <w:lsdException w:name="envelope address" w:semiHidden="1" w:unhideWhenUsed="1"/>
+    <w:lsdException w:name="envelope return" w:semiHidden="1" w:unhideWhenUsed="1"/>
+    <w:lsdException w:name="footnote reference" w:semiHidden="1" w:unhideWhenUsed="1"/>
+    <w:lsdException w:name="annotation reference" w:semiHidden="1" w:unhideWhenUsed="1"/>
+    <w:lsdException w:name="line number" w:semiHidden="1" w:unhideWhenUsed="1"/>
+    <w:lsdException w:name="page number" w:semiHidden="1" w:unhideWhenUsed="1"/>
+    <w:lsdException w:name="endnote reference" w:semiHidden="1" w:unhideWhenUsed="1"/>
+    <w:lsdException w:name="endnote text" w:semiHidden="1" w:unhideWhenUsed="1"/>
+    <w:lsdException w:name="table of authorities" w:semiHidden="1" w:unhideWhenUsed="1"/>
+    <w:lsdException w:name="macro" w:semiHidden="1" w:unhideWhenUsed="1"/>
+    <w:lsdException w:name="toa heading" w:semiHidden="1" w:unhideWhenUsed="1"/>
+    <w:lsdException w:name="List" w:semiHidden="1" w:unhideWhenUsed="1"/>
+    <w:lsdException w:name="List Bullet" w:semiHidden="1" w:unhideWhenUsed="1"/>
+    <w:lsdException w:name="List Number" w:semiHidden="1" w:unhideWhenUsed="1"/>
+    <w:lsdException w:name="List 2" w:semiHidden="1" w:unhideWhenUsed="1"/>
+    <w:lsdException w:name="List 3" w:semiHidden="1" w:unhideWhenUsed="1"/>
+    <w:lsdException w:name="List 4" w:semiHidden="1" w:unhideWhenUsed="1"/>
+    <w:lsdException w:name="List 5" w:semiHidden="1" w:unhideWhenUsed="1"/>
+    <w:lsdException w:name="List Bullet 2" w:semiHidden="1" w:unhideWhenUsed="1"/>
+    <w:lsdException w:name="List Bullet 3" w:semiHidden="1" w:unhideWhenUsed="1"/>
+    <w:lsdException w:name="List Bullet 4" w:semiHidden="1" w:unhideWhenUsed="1"/>
+    <w:lsdException w:name="List Bullet 5" w:semiHidden="1" w:unhideWhenUsed="1"/>
+    <w:lsdException w:name="List Number 2" w:semiHidden="1" w:unhideWhenUsed="1"/>
+    <w:lsdException w:name="List Number 3" w:semiHidden="1" w:unhideWhenUsed="1"/>
+    <w:lsdException w:name="List Number 4" w:semiHidden="1" w:unhideWhenUsed="1"/>
+    <w:lsdException w:name="List Number 5" w:semiHidden="1" w:unhideWhenUsed="1"/>
+    <w:lsdException w:name="Title" w:uiPriority="10" w:qFormat="1"/>
+    <w:lsdException w:name="Closing" w:semiHidden="1" w:unhideWhenUsed="1"/>
+    <w:lsdException w:name="Signature" w:semiHidden="1" w:unhideWhenUsed="1"/>
+    <w:lsdException w:name="Default Paragraph Font" w:semiHidden="1" w:uiPriority="1" w:unhideWhenUsed="1"/>
+    <w:lsdException w:name="Body Text" w:semiHidden="1" w:unhideWhenUsed="1"/>
+    <w:lsdException w:name="Body Text Indent" w:semiHidden="1" w:unhideWhenUsed="1"/>
+    <w:lsdException w:name="List Continue" w:semiHidden="1" w:unhideWhenUsed="1"/>
+    <w:lsdException w:name="List Continue 2" w:semiHidden="1" w:unhideWhenUsed="1"/>
+    <w:lsdException w:name="List Continue 3" w:semiHidden="1" w:unhideWhenUsed="1"/>
+    <w:lsdException w:name="List Continue 4" w:semiHidden="1" w:unhideWhenUsed="1"/>
+    <w:lsdException w:name="List Continue 5" w:semiHidden="1" w:unhideWhenUsed="1"/>
+    <w:lsdException w:name="Message Header" w:semiHidden="1" w:unhideWhenUsed="1"/>
+    <w:lsdException w:name="Subtitle" w:uiPriority="11" w:qFormat="1"/>
+    <w:lsdException w:name="Salutation" w:semiHidden="1" w:unhideWhenUsed="1"/>
+    <w:lsdException w:name="Date" w:semiHidden="1" w:unhideWhenUsed="1"/>
+    <w:lsdException w:name="Body Text First Indent" w:semiHidden="1" w:unhideWhenUsed="1"/>
+    <w:lsdException w:name="Body Text First Indent 2" w:semiHidden="1" w:unhideWhenUsed="1"/>
+    <w:lsdException w:name="Note Heading" w:semiHidden="1" w:unhideWhenUsed="1"/>
+    <w:lsdException w:name="Body Text 2" w:semiHidden="1" w:unhideWhenUsed="1"/>
+    <w:lsdException w:name="Body Text 3" w:semiHidden="1" w:unhideWhenUsed="1"/>
+    <w:lsdException w:name="Body Text Indent 2" w:semiHidden="1" w:unhideWhenUsed="1"/>
+    <w:lsdException w:name="Body Text Indent 3" w:semiHidden="1" w:unhideWhenUsed="1"/>
+    <w:lsdException w:name="Block Text" w:semiHidden="1" w:unhideWhenUsed="1"/>
+    <w:lsdException w:name="Hyperlink" w:semiHidden="1" w:unhideWhenUsed="1"/>
+    <w:lsdException w:name="FollowedHyperlink" w:semiHidden="1" w:unhideWhenUsed="1"/>
+    <w:lsdException w:name="Strong" w:uiPriority="22" w:qFormat="1"/>
+    <w:lsdException w:name="Emphasis" w:uiPriority="20" w:qFormat="1"/>
+    <w:lsdException w:name="Document Map" w:semiHidden="1" w:unhideWhenUsed="1"/>
+    <w:lsdException w:name="Plain Text" w:semiHidden="1" w:unhideWhenUsed="1"/>
+    <w:lsdException w:name="E-mail Signature" w:semiHidden="1" w:unhideWhenUsed="1"/>
+    <w:lsdException w:name="HTML Top of Form" w:semiHidden="1" w:unhideWhenUsed="1"/>
+    <w:lsdException w:name="HTML Bottom of Form" w:semiHidden="1" w:unhideWhenUsed="1"/>
+    <w:lsdException w:name="Normal (Web)" w:semiHidden="1" w:unhideWhenUsed="1" w:qFormat="1"/>
+    <w:lsdException w:name="HTML Acronym" w:semiHidden="1" w:unhideWhenUsed="1"/>
+    <w:lsdException w:name="HTML Address" w:semiHidden="1" w:unhideWhenUsed="1"/>
+    <w:lsdException w:name="HTML Cite" w:semiHidden="1" w:unhideWhenUsed="1"/>
+    <w:lsdException w:name="HTML Code" w:semiHidden="1" w:unhideWhenUsed="1" w:qFormat="1"/>
+    <w:lsdException w:name="HTML Definition" w:semiHidden="1" w:unhideWhenUsed="1"/>
+    <w:lsdException w:name="HTML Keyboard" w:semiHidden="1" w:unhideWhenUsed="1"/>
+    <w:lsdException w:name="HTML Preformatted" w:semiHidden="1" w:unhideWhenUsed="1"/>
+    <w:lsdException w:name="HTML Sample" w:semiHidden="1" w:unhideWhenUsed="1"/>
+    <w:lsdException w:name="HTML Typewriter" w:semiHidden="1" w:unhideWhenUsed="1"/>
+    <w:lsdException w:name="HTML Variable" w:semiHidden="1" w:unhideWhenUsed="1"/>
+    <w:lsdException w:name="Normal Table" w:semiHidden="1" w:unhideWhenUsed="1" w:qFormat="1"/>
+    <w:lsdException w:name="annotation subject" w:semiHidden="1" w:unhideWhenUsed="1"/>
+    <w:lsdException w:name="No List" w:semiHidden="1" w:unhideWhenUsed="1"/>
+    <w:lsdException w:name="Outline List 1" w:semiHidden="1" w:unhideWhenUsed="1"/>
+    <w:lsdException w:name="Outline List 2" w:semiHidden="1" w:unhideWhenUsed="1"/>
+    <w:lsdException w:name="Outline List 3" w:semiHidden="1" w:unhideWhenUsed="1"/>
+    <w:lsdException w:name="Table Simple 1" w:semiHidden="1" w:unhideWhenUsed="1"/>
+    <w:lsdException w:name="Table Simple 2" w:semiHidden="1" w:unhideWhenUsed="1"/>
+    <w:lsdException w:name="Table Simple 3" w:semiHidden="1" w:unhideWhenUsed="1"/>
+    <w:lsdException w:name="Table Classic 1" w:semiHidden="1" w:unhideWhenUsed="1"/>
+    <w:lsdException w:name="Table Classic 2" w:semiHidden="1" w:unhideWhenUsed="1"/>
+    <w:lsdException w:name="Table Classic 3" w:semiHidden="1" w:unhideWhenUsed="1"/>
+    <w:lsdException w:name="Table Classic 4" w:semiHidden="1" w:unhideWhenUsed="1"/>
+    <w:lsdException w:name="Table Colorful 1" w:semiHidden="1" w:unhideWhenUsed="1"/>
+    <w:lsdException w:name="Table Colorful 2" w:semiHidden="1" w:unhideWhenUsed="1"/>
+    <w:lsdException w:name="Table Colorful 3" w:semiHidden="1" w:unhideWhenUsed="1"/>
+    <w:lsdException w:name="Table Columns 1" w:semiHidden="1" w:unhideWhenUsed="1"/>
+    <w:lsdException w:name="Table Columns 2" w:semiHidden="1" w:unhideWhenUsed="1"/>
+    <w:lsdException w:name="Table Columns 3" w:semiHidden="1" w:unhideWhenUsed="1"/>
+    <w:lsdException w:name="Table Columns 4" w:semiHidden="1" w:unhideWhenUsed="1"/>
+    <w:lsdException w:name="Table Columns 5" w:semiHidden="1" w:unhideWhenUsed="1"/>
+    <w:lsdException w:name="Table Grid 1" w:semiHidden="1" w:unhideWhenUsed="1"/>
+    <w:lsdException w:name="Table Grid 2" w:semiHidden="1" w:unhideWhenUsed="1"/>
+    <w:lsdException w:name="Table Grid 3" w:semiHidden="1" w:unhideWhenUsed="1"/>
+    <w:lsdException w:name="Table Grid 4" w:semiHidden="1" w:unhideWhenUsed="1"/>
+    <w:lsdException w:name="Table Grid 5" w:semiHidden="1" w:unhideWhenUsed="1"/>
+    <w:lsdException w:name="Table Grid 6" w:semiHidden="1" w:unhideWhenUsed="1"/>
+    <w:lsdException w:name="Table Grid 7" w:semiHidden="1" w:unhideWhenUsed="1"/>
+    <w:lsdException w:name="Table Grid 8" w:semiHidden="1" w:unhideWhenUsed="1"/>
+    <w:lsdException w:name="Table List 1" w:semiHidden="1" w:unhideWhenUsed="1"/>
+    <w:lsdException w:name="Table List 2" w:semiHidden="1" w:unhideWhenUsed="1"/>
+    <w:lsdException w:name="Table List 3" w:semiHidden="1" w:unhideWhenUsed="1"/>
+    <w:lsdException w:name="Table List 4" w:semiHidden="1" w:unhideWhenUsed="1"/>
+    <w:lsdException w:name="Table List 5" w:semiHidden="1" w:unhideWhenUsed="1"/>
+    <w:lsdException w:name="Table List 6" w:semiHidden="1" w:unhideWhenUsed="1"/>
+    <w:lsdException w:name="Table List 7" w:semiHidden="1" w:unhideWhenUsed="1"/>
+    <w:lsdException w:name="Table List 8" w:semiHidden="1" w:unhideWhenUsed="1"/>
+    <w:lsdException w:name="Table 3D effects 1" w:semiHidden="1" w:unhideWhenUsed="1"/>
+    <w:lsdException w:name="Table 3D effects 2" w:semiHidden="1" w:unhideWhenUsed="1"/>
+    <w:lsdException w:name="Table 3D effects 3" w:semiHidden="1" w:unhideWhenUsed="1"/>
+    <w:lsdException w:name="Table Contemporary" w:semiHidden="1" w:unhideWhenUsed="1"/>
+    <w:lsdException w:name="Table Elegant" w:semiHidden="1" w:unhideWhenUsed="1"/>
+    <w:lsdException w:name="Table Professional" w:semiHidden="1" w:unhideWhenUsed="1"/>
+    <w:lsdException w:name="Table Subtle 1" w:semiHidden="1" w:unhideWhenUsed="1"/>
+    <w:lsdException w:name="Table Subtle 2" w:semiHidden="1" w:unhideWhenUsed="1"/>
+    <w:lsdException w:name="Table Web 1" w:semiHidden="1" w:unhideWhenUsed="1"/>
+    <w:lsdException w:name="Table Web 2" w:semiHidden="1" w:unhideWhenUsed="1"/>
+    <w:lsdException w:name="Table Web 3" w:semiHidden="1" w:unhideWhenUsed="1"/>
+    <w:lsdException w:name="Balloon Text" w:semiHidden="1" w:unhideWhenUsed="1"/>
+    <w:lsdException w:name="Table Grid" w:uiPriority="39" w:qFormat="1"/>
+    <w:lsdException w:name="Table Theme" w:semiHidden="1" w:unhideWhenUsed="1"/>
+    <w:lsdException w:name="Placeholder Text" w:semiHidden="1"/>
+    <w:lsdException w:name="Light Shading"/>
+    <w:lsdException w:name="Light List"/>
+    <w:lsdException w:name="Light Grid"/>
+    <w:lsdException w:name="Medium Shading 1"/>
+    <w:lsdException w:name="Medium Shading 2"/>
+    <w:lsdException w:name="Medium List 1"/>
+    <w:lsdException w:name="Medium List 2"/>
+    <w:lsdException w:name="Medium Grid 1"/>
+    <w:lsdException w:name="Medium Grid 2"/>
+    <w:lsdException w:name="Medium Grid 3"/>
+    <w:lsdException w:name="Dark List"/>
+    <w:lsdException w:name="Colorful Shading"/>
+    <w:lsdException w:name="Colorful List"/>
+    <w:lsdException w:name="Colorful Grid"/>
+    <w:lsdException w:name="Light Shading Accent 1"/>
+    <w:lsdException w:name="Light List Accent 1"/>
+    <w:lsdException w:name="Light Grid Accent 1"/>
+    <w:lsdException w:name="Medium Shading 1 Accent 1"/>
+    <w:lsdException w:name="Medium Shading 2 Accent 1"/>
+    <w:lsdException w:name="Medium List 1 Accent 1"/>
+    <w:lsdException w:name="Revision" w:semiHidden="1"/>
+    <w:lsdException w:name="List Paragraph" w:uiPriority="34" w:qFormat="1"/>
+    <w:lsdException w:name="Quote" w:uiPriority="29" w:qFormat="1"/>
+    <w:lsdException w:name="Intense Quote" w:uiPriority="30" w:qFormat="1"/>
+    <w:lsdException w:name="Medium List 2 Accent 1"/>
+    <w:lsdException w:name="Medium Grid 1 Accent 1"/>
+    <w:lsdException w:name="Medium Grid 2 Accent 1"/>
+    <w:lsdException w:name="Medium Grid 3 Accent 1"/>
+    <w:lsdException w:name="Dark List Accent 1"/>
+    <w:lsdException w:name="Colorful Shading Accent 1"/>
+    <w:lsdException w:name="Colorful List Accent 1"/>
+    <w:lsdException w:name="Colorful Grid Accent 1"/>
+    <w:lsdException w:name="Light Shading Accent 2"/>
+    <w:lsdException w:name="Light List Accent 2"/>
+    <w:lsdException w:name="Light Grid Accent 2"/>
+    <w:lsdException w:name="Medium Shading 1 Accent 2"/>
+    <w:lsdException w:name="Medium Shading 2 Accent 2"/>
+    <w:lsdException w:name="Medium List 1 Accent 2"/>
+    <w:lsdException w:name="Medium List 2 Accent 2"/>
+    <w:lsdException w:name="Medium Grid 1 Accent 2"/>
+    <w:lsdException w:name="Medium Grid 2 Accent 2"/>
+    <w:lsdException w:name="Medium Grid 3 Accent 2"/>
+    <w:lsdException w:name="Dark List Accent 2"/>
+    <w:lsdException w:name="Colorful Shading Accent 2"/>
+    <w:lsdException w:name="Colorful List Accent 2"/>
+    <w:lsdException w:name="Colorful Grid Accent 2"/>
+    <w:lsdException w:name="Light Shading Accent 3"/>
+    <w:lsdException w:name="Light List Accent 3"/>
+    <w:lsdException w:name="Light Grid Accent 3"/>
+    <w:lsdException w:name="Medium Shading 1 Accent 3"/>
+    <w:lsdException w:name="Medium Shading 2 Accent 3"/>
+    <w:lsdException w:name="Medium List 1 Accent 3"/>
+    <w:lsdException w:name="Medium List 2 Accent 3"/>
+    <w:lsdException w:name="Medium Grid 1 Accent 3"/>
+    <w:lsdException w:name="Medium Grid 2 Accent 3"/>
+    <w:lsdException w:name="Medium Grid 3 Accent 3"/>
+    <w:lsdException w:name="Dark List Accent 3"/>
+    <w:lsdException w:name="Colorful Shading Accent 3"/>
+    <w:lsdException w:name="Colorful List Accent 3"/>
+    <w:lsdException w:name="Colorful Grid Accent 3"/>
+    <w:lsdException w:name="Light Shading Accent 4"/>
+    <w:lsdException w:name="Light List Accent 4"/>
+    <w:lsdException w:name="Light Grid Accent 4"/>
+    <w:lsdException w:name="Medium Shading 1 Accent 4"/>
+    <w:lsdException w:name="Medium Shading 2 Accent 4"/>
+    <w:lsdException w:name="Medium List 1 Accent 4"/>
+    <w:lsdException w:name="Medium List 2 Accent 4"/>
+    <w:lsdException w:name="Medium Grid 1 Accent 4"/>
+    <w:lsdException w:name="Medium Grid 2 Accent 4"/>
+    <w:lsdException w:name="Medium Grid 3 Accent 4"/>
+    <w:lsdException w:name="Dark List Accent 4"/>
+    <w:lsdException w:name="Colorful Shading Accent 4"/>
+    <w:lsdException w:name="Colorful List Accent 4"/>
+    <w:lsdException w:name="Colorful Grid Accent 4"/>
+    <w:lsdException w:name="Light Shading Accent 5"/>
+    <w:lsdException w:name="Light List Accent 5"/>
+    <w:lsdException w:name="Light Grid Accent 5"/>
+    <w:lsdException w:name="Medium Shading 1 Accent 5"/>
+    <w:lsdException w:name="Medium Shading 2 Accent 5"/>
+    <w:lsdException w:name="Medium List 1 Accent 5"/>
+    <w:lsdException w:name="Medium List 2 Accent 5"/>
+    <w:lsdException w:name="Medium Grid 1 Accent 5"/>
+    <w:lsdException w:name="Medium Grid 2 Accent 5"/>
+    <w:lsdException w:name="Medium Grid 3 Accent 5"/>
+    <w:lsdException w:name="Dark List Accent 5"/>
+    <w:lsdException w:name="Colorful Shading Accent 5"/>
+    <w:lsdException w:name="Colorful List Accent 5"/>
+    <w:lsdException w:name="Colorful Grid Accent 5"/>
+    <w:lsdException w:name="Light Shading Accent 6"/>
+    <w:lsdException w:name="Light List Accent 6"/>
+    <w:lsdException w:name="Light Grid Accent 6"/>
+    <w:lsdException w:name="Medium Shading 1 Accent 6"/>
+    <w:lsdException w:name="Medium Shading 2 Accent 6"/>
+    <w:lsdException w:name="Medium List 1 Accent 6"/>
+    <w:lsdException w:name="Medium List 2 Accent 6"/>
+    <w:lsdException w:name="Medium Grid 1 Accent 6"/>
+    <w:lsdException w:name="Medium Grid 2 Accent 6"/>
+    <w:lsdException w:name="Medium Grid 3 Accent 6"/>
+    <w:lsdException w:name="Dark List Accent 6"/>
+    <w:lsdException w:name="Colorful Shading Accent 6"/>
+    <w:lsdException w:name="Colorful List Accent 6"/>
+    <w:lsdException w:name="Colorful Grid Accent 6"/>
+    <w:lsdException w:name="Subtle Emphasis" w:uiPriority="19" w:qFormat="1"/>
+    <w:lsdException w:name="Intense Emphasis" w:uiPriority="21" w:qFormat="1"/>
+    <w:lsdException w:name="Subtle Reference" w:uiPriority="31" w:qFormat="1"/>
+    <w:lsdException w:name="Intense Reference" w:uiPriority="32" w:qFormat="1"/>
+    <w:lsdException w:name="Book Title" w:uiPriority="33" w:qFormat="1"/>
+    <w:lsdException w:name="Bibliography" w:semiHidden="1" w:uiPriority="37" w:unhideWhenUsed="1"/>
+    <w:lsdException w:name="TOC Heading" w:semiHidden="1" w:uiPriority="39" w:unhideWhenUsed="1" w:qFormat="1"/>
+    <w:lsdException w:name="Plain Table 1" w:uiPriority="41"/>
+    <w:lsdException w:name="Plain Table 2" w:uiPriority="42"/>
+    <w:lsdException w:name="Plain Table 3" w:uiPriority="43"/>
+    <w:lsdException w:name="Plain Table 4" w:uiPriority="44"/>
+    <w:lsdException w:name="Plain Table 5" w:uiPriority="45"/>
+    <w:lsdException w:name="Grid Table Light" w:uiPriority="40"/>
+    <w:lsdException w:name="Grid Table 1 Light" w:uiPriority="46"/>
+    <w:lsdException w:name="Grid Table 2" w:uiPriority="47"/>
+    <w:lsdException w:name="Grid Table 3" w:uiPriority="48"/>
+    <w:lsdException w:name="Grid Table 4" w:uiPriority="49"/>
+    <w:lsdException w:name="Grid Table 5 Dark" w:uiPriority="50"/>
+    <w:lsdException w:name="Grid Table 6 Colorful" w:uiPriority="51"/>
+    <w:lsdException w:name="Grid Table 7 Colorful" w:uiPriority="52"/>
+    <w:lsdException w:name="Grid Table 1 Light Accent 1" w:uiPriority="46"/>
+    <w:lsdException w:name="Grid Table 2 Accent 1" w:uiPriority="47"/>
+    <w:lsdException w:name="Grid Table 3 Accent 1" w:uiPriority="48"/>
+    <w:lsdException w:name="Grid Table 4 Accent 1" w:uiPriority="49"/>
+    <w:lsdException w:name="Grid Table 5 Dark Accent 1" w:uiPriority="50"/>
+    <w:lsdException w:name="Grid Table 6 Colorful Accent 1" w:uiPriority="51"/>
+    <w:lsdException w:name="Grid Table 7 Colorful Accent 1" w:uiPriority="52"/>
+    <w:lsdException w:name="Grid Table 1 Light Accent 2" w:uiPriority="46"/>
+    <w:lsdException w:name="Grid Table 2 Accent 2" w:uiPriority="47"/>
+    <w:lsdException w:name="Grid Table 3 Accent 2" w:uiPriority="48"/>
+    <w:lsdException w:name="Grid Table 4 Accent 2" w:uiPriority="49"/>
+    <w:lsdException w:name="Grid Table 5 Dark Accent 2" w:uiPriority="50"/>
+    <w:lsdException w:name="Grid Table 6 Colorful Accent 2" w:uiPriority="51"/>
+    <w:lsdException w:name="Grid Table 7 Colorful Accent 2" w:uiPriority="52"/>
+    <w:lsdException w:name="Grid Table 1 Light Accent 3" w:uiPriority="46"/>
+    <w:lsdException w:name="Grid Table 2 Accent 3" w:uiPriority="47"/>
+    <w:lsdException w:name="Grid Table 3 Accent 3" w:uiPriority="48"/>
+    <w:lsdException w:name="Grid Table 4 Accent 3" w:uiPriority="49"/>
+    <w:lsdException w:name="Grid Table 5 Dark Accent 3" w:uiPriority="50"/>
+    <w:lsdException w:name="Grid Table 6 Colorful Accent 3" w:uiPriority="51"/>
+    <w:lsdException w:name="Grid Table 7 Colorful Accent 3" w:uiPriority="52"/>
+    <w:lsdException w:name="Grid Table 1 Light Accent 4" w:uiPriority="46"/>
+    <w:lsdException w:name="Grid Table 2 Accent 4" w:uiPriority="47"/>
+    <w:lsdException w:name="Grid Table 3 Accent 4" w:uiPriority="48"/>
+    <w:lsdException w:name="Grid Table 4 Accent 4" w:uiPriority="49"/>
+    <w:lsdException w:name="Grid Table 5 Dark Accent 4" w:uiPriority="50"/>
+    <w:lsdException w:name="Grid Table 6 Colorful Accent 4" w:uiPriority="51"/>
+    <w:lsdException w:name="Grid Table 7 Colorful Accent 4" w:uiPriority="52"/>
+    <w:lsdException w:name="Grid Table 1 Light Accent 5" w:uiPriority="46"/>
+    <w:lsdException w:name="Grid Table 2 Accent 5" w:uiPriority="47"/>
+    <w:lsdException w:name="Grid Table 3 Accent 5" w:uiPriority="48"/>
+    <w:lsdException w:name="Grid Table 4 Accent 5" w:uiPriority="49"/>
+    <w:lsdException w:name="Grid Table 5 Dark Accent 5" w:uiPriority="50"/>
+    <w:lsdException w:name="Grid Table 6 Colorful Accent 5" w:uiPriority="51"/>
+    <w:lsdException w:name="Grid Table 7 Colorful Accent 5" w:uiPriority="52"/>
+    <w:lsdException w:name="Grid Table 1 Light Accent 6" w:uiPriority="46"/>
+    <w:lsdException w:name="Grid Table 2 Accent 6" w:uiPriority="47"/>
+    <w:lsdException w:name="Grid Table 3 Accent 6" w:uiPriority="48"/>
+    <w:lsdException w:name="Grid Table 4 Accent 6" w:uiPriority="49"/>
+    <w:lsdException w:name="Grid Table 5 Dark Accent 6" w:uiPriority="50"/>
+    <w:lsdException w:name="Grid Table 6 Colorful Accent 6" w:uiPriority="51"/>
+    <w:lsdException w:name="Grid Table 7 Colorful Accent 6" w:uiPriority="52"/>
+    <w:lsdException w:name="List Table 1 Light" w:uiPriority="46"/>
+    <w:lsdException w:name="List Table 2" w:uiPriority="47"/>
+    <w:lsdException w:name="List Table 3" w:uiPriority="48"/>
+    <w:lsdException w:name="List Table 4" w:uiPriority="49"/>
+    <w:lsdException w:name="List Table 5 Dark" w:uiPriority="50"/>
+    <w:lsdException w:name="List Table 6 Colorful" w:uiPriority="51"/>
+    <w:lsdException w:name="List Table 7 Colorful" w:uiPriority="52"/>
+    <w:lsdException w:name="List Table 1 Light Accent 1" w:uiPriority="46"/>
+    <w:lsdException w:name="List Table 2 Accent 1" w:uiPriority="47"/>
+    <w:lsdException w:name="List Table 3 Accent 1" w:uiPriority="48"/>
+    <w:lsdException w:name="List Table 4 Accent 1" w:uiPriority="49"/>
+    <w:lsdException w:name="List Table 5 Dark Accent 1" w:uiPriority="50"/>
+    <w:lsdException w:name="List Table 6 Colorful Accent 1" w:uiPriority="51"/>
+    <w:lsdException w:name="List Table 7 Colorful Accent 1" w:uiPriority="52"/>
+    <w:lsdException w:name="List Table 1 Light Accent 2" w:uiPriority="46"/>
+    <w:lsdException w:name="List Table 2 Accent 2" w:uiPriority="47"/>
+    <w:lsdException w:name="List Table 3 Accent 2" w:uiPriority="48"/>
+    <w:lsdException w:name="List Table 4 Accent 2" w:uiPriority="49"/>
+    <w:lsdException w:name="List Table 5 Dark Accent 2" w:uiPriority="50"/>
+    <w:lsdException w:name="List Table 6 Colorful Accent 2" w:uiPriority="51"/>
+    <w:lsdException w:name="List Table 7 Colorful Accent 2" w:uiPriority="52"/>
+    <w:lsdException w:name="List Table 1 Light Accent 3" w:uiPriority="46"/>
+    <w:lsdException w:name="List Table 2 Accent 3" w:uiPriority="47"/>
+    <w:lsdException w:name="List Table 3 Accent 3" w:uiPriority="48"/>
+    <w:lsdException w:name="List Table 4 Accent 3" w:uiPriority="49"/>
+    <w:lsdException w:name="List Table 5 Dark Accent 3" w:uiPriority="50"/>
+    <w:lsdException w:name="List Table 6 Colorful Accent 3" w:uiPriority="51"/>
+    <w:lsdException w:name="List Table 7 Colorful Accent 3" w:uiPriority="52"/>
+    <w:lsdException w:name="List Table 1 Light Accent 4" w:uiPriority="46"/>
+    <w:lsdException w:name="List Table 2 Accent 4" w:uiPriority="47"/>
+    <w:lsdException w:name="List Table 3 Accent 4" w:uiPriority="48"/>
+    <w:lsdException w:name="List Table 4 Accent 4" w:uiPriority="49"/>
+    <w:lsdException w:name="List Table 5 Dark Accent 4" w:uiPriority="50"/>
+    <w:lsdException w:name="List Table 6 Colorful Accent 4" w:uiPriority="51"/>
+    <w:lsdException w:name="List Table 7 Colorful Accent 4" w:uiPriority="52"/>
+    <w:lsdException w:name="List Table 1 Light Accent 5" w:uiPriority="46"/>
+    <w:lsdException w:name="List Table 2 Accent 5" w:uiPriority="47"/>
+    <w:lsdException w:name="List Table 3 Accent 5" w:uiPriority="48"/>
+    <w:lsdException w:name="List Table 4 Accent 5" w:uiPriority="49"/>
+    <w:lsdException w:name="List Table 5 Dark Accent 5" w:uiPriority="50"/>
+    <w:lsdException w:name="List Table 6 Colorful Accent 5" w:uiPriority="51"/>
+    <w:lsdException w:name="List Table 7 Colorful Accent 5" w:uiPriority="52"/>
+    <w:lsdException w:name="List Table 1 Light Accent 6" w:uiPriority="46"/>
+    <w:lsdException w:name="List Table 2 Accent 6" w:uiPriority="47"/>
+    <w:lsdException w:name="List Table 3 Accent 6" w:uiPriority="48"/>
+    <w:lsdException w:name="List Table 4 Accent 6" w:uiPriority="49"/>
+    <w:lsdException w:name="List Table 5 Dark Accent 6" w:uiPriority="50"/>
+    <w:lsdException w:name="List Table 6 Colorful Accent 6" w:uiPriority="51"/>
+    <w:lsdException w:name="List Table 7 Colorful Accent 6" w:uiPriority="52"/>
+    <w:lsdException w:name="Mention" w:semiHidden="1" w:unhideWhenUsed="1"/>
+    <w:lsdException w:name="Smart Hyperlink" w:semiHidden="1" w:unhideWhenUsed="1"/>
+    <w:lsdException w:name="Hashtag" w:semiHidden="1" w:unhideWhenUsed="1"/>
+    <w:lsdException w:name="Unresolved Mention" w:semiHidden="1" w:unhideWhenUsed="1"/>
   </w:latentStyles>
-  <w:style w:type="paragraph" w:default="1" w:styleId="1">
+  <w:style w:type="paragraph" w:default="1" w:styleId="Normal">
     <w:name w:val="Normal"/>
     <w:qFormat/>
-    <w:uiPriority w:val="0"/>
     <w:pPr>
       <w:spacing w:after="160" w:line="259" w:lineRule="auto"/>
     </w:pPr>
     <w:rPr>
-      <w:rFonts w:asciiTheme="minorHAnsi" w:hAnsiTheme="minorHAnsi" w:eastAsiaTheme="minorHAnsi" w:cstheme="minorBidi"/>
       <w:kern w:val="2"/>
       <w:sz w:val="22"/>
       <w:szCs w:val="22"/>
-      <w:lang w:val="pt-BR" w:eastAsia="en-US" w:bidi="ar-SA"/>
+      <w:lang w:eastAsia="en-US"/>
       <w14:ligatures w14:val="standardContextual"/>
     </w:rPr>
   </w:style>
-  <w:style w:type="paragraph" w:styleId="2">
+  <w:style w:type="paragraph" w:styleId="Ttulo1">
     <w:name w:val="heading 1"/>
-    <w:basedOn w:val="1"/>
-    <w:next w:val="1"/>
-    <w:link w:val="21"/>
-    <w:qFormat/>
+    <w:basedOn w:val="Normal"/>
+    <w:next w:val="Normal"/>
+    <w:link w:val="Ttulo1Char"/>
     <w:uiPriority w:val="9"/>
+    <w:qFormat/>
     <w:pPr>
       <w:keepNext/>
       <w:keepLines/>
@@ -1993,21 +2048,21 @@
       <w:outlineLvl w:val="0"/>
     </w:pPr>
     <w:rPr>
-      <w:rFonts w:asciiTheme="majorHAnsi" w:hAnsiTheme="majorHAnsi" w:eastAsiaTheme="majorEastAsia" w:cstheme="majorBidi"/>
-      <w:color w:val="104862" w:themeColor="accent1" w:themeShade="BF"/>
+      <w:rFonts w:asciiTheme="majorHAnsi" w:eastAsiaTheme="majorEastAsia" w:hAnsiTheme="majorHAnsi" w:cstheme="majorBidi"/>
+      <w:color w:val="0F4761" w:themeColor="accent1" w:themeShade="BF"/>
       <w:sz w:val="40"/>
       <w:szCs w:val="40"/>
     </w:rPr>
   </w:style>
-  <w:style w:type="paragraph" w:styleId="3">
+  <w:style w:type="paragraph" w:styleId="Ttulo2">
     <w:name w:val="heading 2"/>
-    <w:basedOn w:val="1"/>
-    <w:next w:val="1"/>
-    <w:link w:val="22"/>
+    <w:basedOn w:val="Normal"/>
+    <w:next w:val="Normal"/>
+    <w:link w:val="Ttulo2Char"/>
+    <w:uiPriority w:val="9"/>
     <w:semiHidden/>
     <w:unhideWhenUsed/>
     <w:qFormat/>
-    <w:uiPriority w:val="9"/>
     <w:pPr>
       <w:keepNext/>
       <w:keepLines/>
@@ -2015,21 +2070,21 @@
       <w:outlineLvl w:val="1"/>
     </w:pPr>
     <w:rPr>
-      <w:rFonts w:asciiTheme="majorHAnsi" w:hAnsiTheme="majorHAnsi" w:eastAsiaTheme="majorEastAsia" w:cstheme="majorBidi"/>
-      <w:color w:val="104862" w:themeColor="accent1" w:themeShade="BF"/>
+      <w:rFonts w:asciiTheme="majorHAnsi" w:eastAsiaTheme="majorEastAsia" w:hAnsiTheme="majorHAnsi" w:cstheme="majorBidi"/>
+      <w:color w:val="0F4761" w:themeColor="accent1" w:themeShade="BF"/>
       <w:sz w:val="32"/>
       <w:szCs w:val="32"/>
     </w:rPr>
   </w:style>
-  <w:style w:type="paragraph" w:styleId="4">
+  <w:style w:type="paragraph" w:styleId="Ttulo3">
     <w:name w:val="heading 3"/>
-    <w:basedOn w:val="1"/>
-    <w:next w:val="1"/>
-    <w:link w:val="23"/>
+    <w:basedOn w:val="Normal"/>
+    <w:next w:val="Normal"/>
+    <w:link w:val="Ttulo3Char"/>
+    <w:uiPriority w:val="9"/>
     <w:semiHidden/>
     <w:unhideWhenUsed/>
     <w:qFormat/>
-    <w:uiPriority w:val="9"/>
     <w:pPr>
       <w:keepNext/>
       <w:keepLines/>
@@ -2038,20 +2093,20 @@
     </w:pPr>
     <w:rPr>
       <w:rFonts w:eastAsiaTheme="majorEastAsia" w:cstheme="majorBidi"/>
-      <w:color w:val="104862" w:themeColor="accent1" w:themeShade="BF"/>
+      <w:color w:val="0F4761" w:themeColor="accent1" w:themeShade="BF"/>
       <w:sz w:val="28"/>
       <w:szCs w:val="28"/>
     </w:rPr>
   </w:style>
-  <w:style w:type="paragraph" w:styleId="5">
+  <w:style w:type="paragraph" w:styleId="Ttulo4">
     <w:name w:val="heading 4"/>
-    <w:basedOn w:val="1"/>
-    <w:next w:val="1"/>
-    <w:link w:val="24"/>
+    <w:basedOn w:val="Normal"/>
+    <w:next w:val="Normal"/>
+    <w:link w:val="Ttulo4Char"/>
+    <w:uiPriority w:val="9"/>
     <w:semiHidden/>
     <w:unhideWhenUsed/>
     <w:qFormat/>
-    <w:uiPriority w:val="9"/>
     <w:pPr>
       <w:keepNext/>
       <w:keepLines/>
@@ -2062,18 +2117,18 @@
       <w:rFonts w:eastAsiaTheme="majorEastAsia" w:cstheme="majorBidi"/>
       <w:i/>
       <w:iCs/>
-      <w:color w:val="104862" w:themeColor="accent1" w:themeShade="BF"/>
-    </w:rPr>
-  </w:style>
-  <w:style w:type="paragraph" w:styleId="6">
+      <w:color w:val="0F4761" w:themeColor="accent1" w:themeShade="BF"/>
+    </w:rPr>
+  </w:style>
+  <w:style w:type="paragraph" w:styleId="Ttulo5">
     <w:name w:val="heading 5"/>
-    <w:basedOn w:val="1"/>
-    <w:next w:val="1"/>
-    <w:link w:val="25"/>
+    <w:basedOn w:val="Normal"/>
+    <w:next w:val="Normal"/>
+    <w:link w:val="Ttulo5Char"/>
+    <w:uiPriority w:val="9"/>
     <w:semiHidden/>
     <w:unhideWhenUsed/>
     <w:qFormat/>
-    <w:uiPriority w:val="9"/>
     <w:pPr>
       <w:keepNext/>
       <w:keepLines/>
@@ -2082,18 +2137,18 @@
     </w:pPr>
     <w:rPr>
       <w:rFonts w:eastAsiaTheme="majorEastAsia" w:cstheme="majorBidi"/>
-      <w:color w:val="104862" w:themeColor="accent1" w:themeShade="BF"/>
-    </w:rPr>
-  </w:style>
-  <w:style w:type="paragraph" w:styleId="7">
+      <w:color w:val="0F4761" w:themeColor="accent1" w:themeShade="BF"/>
+    </w:rPr>
+  </w:style>
+  <w:style w:type="paragraph" w:styleId="Ttulo6">
     <w:name w:val="heading 6"/>
-    <w:basedOn w:val="1"/>
-    <w:next w:val="1"/>
-    <w:link w:val="26"/>
+    <w:basedOn w:val="Normal"/>
+    <w:next w:val="Normal"/>
+    <w:link w:val="Ttulo6Char"/>
+    <w:uiPriority w:val="9"/>
     <w:semiHidden/>
     <w:unhideWhenUsed/>
     <w:qFormat/>
-    <w:uiPriority w:val="9"/>
     <w:pPr>
       <w:keepNext/>
       <w:keepLines/>
@@ -2105,25 +2160,17 @@
       <w:i/>
       <w:iCs/>
       <w:color w:val="595959" w:themeColor="text1" w:themeTint="A6"/>
-      <w14:textFill>
-        <w14:solidFill>
-          <w14:schemeClr w14:val="tx1">
-            <w14:lumMod w14:val="65000"/>
-            <w14:lumOff w14:val="35000"/>
-          </w14:schemeClr>
-        </w14:solidFill>
-      </w14:textFill>
-    </w:rPr>
-  </w:style>
-  <w:style w:type="paragraph" w:styleId="8">
+    </w:rPr>
+  </w:style>
+  <w:style w:type="paragraph" w:styleId="Ttulo7">
     <w:name w:val="heading 7"/>
-    <w:basedOn w:val="1"/>
-    <w:next w:val="1"/>
-    <w:link w:val="27"/>
+    <w:basedOn w:val="Normal"/>
+    <w:next w:val="Normal"/>
+    <w:link w:val="Ttulo7Char"/>
+    <w:uiPriority w:val="9"/>
     <w:semiHidden/>
     <w:unhideWhenUsed/>
     <w:qFormat/>
-    <w:uiPriority w:val="9"/>
     <w:pPr>
       <w:keepNext/>
       <w:keepLines/>
@@ -2133,25 +2180,17 @@
     <w:rPr>
       <w:rFonts w:eastAsiaTheme="majorEastAsia" w:cstheme="majorBidi"/>
       <w:color w:val="595959" w:themeColor="text1" w:themeTint="A6"/>
-      <w14:textFill>
-        <w14:solidFill>
-          <w14:schemeClr w14:val="tx1">
-            <w14:lumMod w14:val="65000"/>
-            <w14:lumOff w14:val="35000"/>
-          </w14:schemeClr>
-        </w14:solidFill>
-      </w14:textFill>
-    </w:rPr>
-  </w:style>
-  <w:style w:type="paragraph" w:styleId="9">
+    </w:rPr>
+  </w:style>
+  <w:style w:type="paragraph" w:styleId="Ttulo8">
     <w:name w:val="heading 8"/>
-    <w:basedOn w:val="1"/>
-    <w:next w:val="1"/>
-    <w:link w:val="28"/>
+    <w:basedOn w:val="Normal"/>
+    <w:next w:val="Normal"/>
+    <w:link w:val="Ttulo8Char"/>
+    <w:uiPriority w:val="9"/>
     <w:semiHidden/>
     <w:unhideWhenUsed/>
     <w:qFormat/>
-    <w:uiPriority w:val="9"/>
     <w:pPr>
       <w:keepNext/>
       <w:keepLines/>
@@ -2163,25 +2202,17 @@
       <w:i/>
       <w:iCs/>
       <w:color w:val="262626" w:themeColor="text1" w:themeTint="D9"/>
-      <w14:textFill>
-        <w14:solidFill>
-          <w14:schemeClr w14:val="tx1">
-            <w14:lumMod w14:val="85000"/>
-            <w14:lumOff w14:val="15000"/>
-          </w14:schemeClr>
-        </w14:solidFill>
-      </w14:textFill>
-    </w:rPr>
-  </w:style>
-  <w:style w:type="paragraph" w:styleId="10">
+    </w:rPr>
+  </w:style>
+  <w:style w:type="paragraph" w:styleId="Ttulo9">
     <w:name w:val="heading 9"/>
-    <w:basedOn w:val="1"/>
-    <w:next w:val="1"/>
-    <w:link w:val="29"/>
+    <w:basedOn w:val="Normal"/>
+    <w:next w:val="Normal"/>
+    <w:link w:val="Ttulo9Char"/>
+    <w:uiPriority w:val="9"/>
     <w:semiHidden/>
     <w:unhideWhenUsed/>
     <w:qFormat/>
-    <w:uiPriority w:val="9"/>
     <w:pPr>
       <w:keepNext/>
       <w:keepLines/>
@@ -2191,29 +2222,21 @@
     <w:rPr>
       <w:rFonts w:eastAsiaTheme="majorEastAsia" w:cstheme="majorBidi"/>
       <w:color w:val="262626" w:themeColor="text1" w:themeTint="D9"/>
-      <w14:textFill>
-        <w14:solidFill>
-          <w14:schemeClr w14:val="tx1">
-            <w14:lumMod w14:val="85000"/>
-            <w14:lumOff w14:val="15000"/>
-          </w14:schemeClr>
-        </w14:solidFill>
-      </w14:textFill>
-    </w:rPr>
-  </w:style>
-  <w:style w:type="character" w:default="1" w:styleId="11">
+    </w:rPr>
+  </w:style>
+  <w:style w:type="character" w:default="1" w:styleId="Fontepargpadro">
     <w:name w:val="Default Paragraph Font"/>
+    <w:uiPriority w:val="1"/>
     <w:semiHidden/>
     <w:unhideWhenUsed/>
-    <w:uiPriority w:val="1"/>
-  </w:style>
-  <w:style w:type="table" w:default="1" w:styleId="12">
+  </w:style>
+  <w:style w:type="table" w:default="1" w:styleId="Tabelanormal">
     <w:name w:val="Normal Table"/>
+    <w:uiPriority w:val="99"/>
     <w:semiHidden/>
     <w:unhideWhenUsed/>
-    <w:qFormat/>
-    <w:uiPriority w:val="99"/>
     <w:tblPr>
+      <w:tblInd w:w="0" w:type="dxa"/>
       <w:tblCellMar>
         <w:top w:w="0" w:type="dxa"/>
         <w:left w:w="108" w:type="dxa"/>
@@ -2222,60 +2245,66 @@
       </w:tblCellMar>
     </w:tblPr>
   </w:style>
-  <w:style w:type="character" w:styleId="13">
+  <w:style w:type="numbering" w:default="1" w:styleId="Semlista">
+    <w:name w:val="No List"/>
+    <w:uiPriority w:val="99"/>
+    <w:semiHidden/>
+    <w:unhideWhenUsed/>
+  </w:style>
+  <w:style w:type="character" w:styleId="Forte">
     <w:name w:val="Strong"/>
-    <w:basedOn w:val="11"/>
-    <w:qFormat/>
+    <w:basedOn w:val="Fontepargpadro"/>
     <w:uiPriority w:val="22"/>
+    <w:qFormat/>
     <w:rPr>
       <w:b/>
       <w:bCs/>
     </w:rPr>
   </w:style>
-  <w:style w:type="character" w:styleId="14">
+  <w:style w:type="character" w:styleId="CdigoHTML">
     <w:name w:val="HTML Code"/>
-    <w:basedOn w:val="11"/>
+    <w:basedOn w:val="Fontepargpadro"/>
+    <w:uiPriority w:val="99"/>
     <w:semiHidden/>
     <w:unhideWhenUsed/>
     <w:qFormat/>
-    <w:uiPriority w:val="99"/>
-    <w:rPr>
-      <w:rFonts w:ascii="Courier New" w:hAnsi="Courier New" w:eastAsia="Times New Roman" w:cs="Courier New"/>
+    <w:rPr>
+      <w:rFonts w:ascii="Courier New" w:eastAsia="Times New Roman" w:hAnsi="Courier New" w:cs="Courier New"/>
       <w:sz w:val="20"/>
       <w:szCs w:val="20"/>
     </w:rPr>
   </w:style>
-  <w:style w:type="paragraph" w:styleId="15">
+  <w:style w:type="paragraph" w:styleId="Ttulo">
     <w:name w:val="Title"/>
-    <w:basedOn w:val="1"/>
-    <w:next w:val="1"/>
-    <w:link w:val="30"/>
-    <w:qFormat/>
+    <w:basedOn w:val="Normal"/>
+    <w:next w:val="Normal"/>
+    <w:link w:val="TtuloChar"/>
     <w:uiPriority w:val="10"/>
+    <w:qFormat/>
     <w:pPr>
       <w:spacing w:after="80" w:line="240" w:lineRule="auto"/>
       <w:contextualSpacing/>
     </w:pPr>
     <w:rPr>
-      <w:rFonts w:asciiTheme="majorHAnsi" w:hAnsiTheme="majorHAnsi" w:eastAsiaTheme="majorEastAsia" w:cstheme="majorBidi"/>
+      <w:rFonts w:asciiTheme="majorHAnsi" w:eastAsiaTheme="majorEastAsia" w:hAnsiTheme="majorHAnsi" w:cstheme="majorBidi"/>
       <w:spacing w:val="-10"/>
       <w:kern w:val="28"/>
       <w:sz w:val="56"/>
       <w:szCs w:val="56"/>
     </w:rPr>
   </w:style>
-  <w:style w:type="paragraph" w:styleId="16">
+  <w:style w:type="paragraph" w:styleId="NormalWeb">
     <w:name w:val="Normal (Web)"/>
-    <w:basedOn w:val="1"/>
+    <w:basedOn w:val="Normal"/>
+    <w:uiPriority w:val="99"/>
     <w:semiHidden/>
     <w:unhideWhenUsed/>
     <w:qFormat/>
-    <w:uiPriority w:val="99"/>
     <w:pPr>
       <w:spacing w:before="100" w:beforeAutospacing="1" w:after="100" w:afterAutospacing="1" w:line="240" w:lineRule="auto"/>
     </w:pPr>
     <w:rPr>
-      <w:rFonts w:ascii="Times New Roman" w:hAnsi="Times New Roman" w:eastAsia="Times New Roman" w:cs="Times New Roman"/>
+      <w:rFonts w:ascii="Times New Roman" w:eastAsia="Times New Roman" w:hAnsi="Times New Roman" w:cs="Times New Roman"/>
       <w:kern w:val="0"/>
       <w:sz w:val="24"/>
       <w:szCs w:val="24"/>
@@ -2283,13 +2312,13 @@
       <w14:ligatures w14:val="none"/>
     </w:rPr>
   </w:style>
-  <w:style w:type="paragraph" w:styleId="17">
+  <w:style w:type="paragraph" w:styleId="Cabealho">
     <w:name w:val="header"/>
-    <w:basedOn w:val="1"/>
-    <w:link w:val="39"/>
+    <w:basedOn w:val="Normal"/>
+    <w:link w:val="CabealhoChar"/>
+    <w:uiPriority w:val="99"/>
     <w:unhideWhenUsed/>
     <w:qFormat/>
-    <w:uiPriority w:val="99"/>
     <w:pPr>
       <w:tabs>
         <w:tab w:val="center" w:pos="4252"/>
@@ -2298,13 +2327,13 @@
       <w:spacing w:after="0" w:line="240" w:lineRule="auto"/>
     </w:pPr>
   </w:style>
-  <w:style w:type="paragraph" w:styleId="18">
+  <w:style w:type="paragraph" w:styleId="Rodap">
     <w:name w:val="footer"/>
-    <w:basedOn w:val="1"/>
-    <w:link w:val="40"/>
+    <w:basedOn w:val="Normal"/>
+    <w:link w:val="RodapChar"/>
+    <w:uiPriority w:val="99"/>
     <w:unhideWhenUsed/>
     <w:qFormat/>
-    <w:uiPriority w:val="99"/>
     <w:pPr>
       <w:tabs>
         <w:tab w:val="center" w:pos="4252"/>
@@ -2313,239 +2342,188 @@
       <w:spacing w:after="0" w:line="240" w:lineRule="auto"/>
     </w:pPr>
   </w:style>
-  <w:style w:type="paragraph" w:styleId="19">
+  <w:style w:type="paragraph" w:styleId="Subttulo">
     <w:name w:val="Subtitle"/>
-    <w:basedOn w:val="1"/>
-    <w:next w:val="1"/>
-    <w:link w:val="31"/>
-    <w:qFormat/>
+    <w:basedOn w:val="Normal"/>
+    <w:next w:val="Normal"/>
+    <w:link w:val="SubttuloChar"/>
     <w:uiPriority w:val="11"/>
+    <w:qFormat/>
     <w:rPr>
       <w:rFonts w:eastAsiaTheme="majorEastAsia" w:cstheme="majorBidi"/>
       <w:color w:val="595959" w:themeColor="text1" w:themeTint="A6"/>
       <w:spacing w:val="15"/>
       <w:sz w:val="28"/>
       <w:szCs w:val="28"/>
-      <w14:textFill>
-        <w14:solidFill>
-          <w14:schemeClr w14:val="tx1">
-            <w14:lumMod w14:val="65000"/>
-            <w14:lumOff w14:val="35000"/>
-          </w14:schemeClr>
-        </w14:solidFill>
-      </w14:textFill>
-    </w:rPr>
-  </w:style>
-  <w:style w:type="table" w:styleId="20">
+    </w:rPr>
+  </w:style>
+  <w:style w:type="table" w:styleId="Tabelacomgrade">
     <w:name w:val="Table Grid"/>
-    <w:basedOn w:val="12"/>
-    <w:qFormat/>
+    <w:basedOn w:val="Tabelanormal"/>
     <w:uiPriority w:val="39"/>
-    <w:pPr>
-      <w:spacing w:after="0" w:line="240" w:lineRule="auto"/>
-    </w:pPr>
+    <w:qFormat/>
     <w:tblPr>
       <w:tblBorders>
-        <w:top w:val="single" w:color="auto" w:sz="4" w:space="0"/>
-        <w:left w:val="single" w:color="auto" w:sz="4" w:space="0"/>
-        <w:bottom w:val="single" w:color="auto" w:sz="4" w:space="0"/>
-        <w:right w:val="single" w:color="auto" w:sz="4" w:space="0"/>
-        <w:insideH w:val="single" w:color="auto" w:sz="4" w:space="0"/>
-        <w:insideV w:val="single" w:color="auto" w:sz="4" w:space="0"/>
+        <w:top w:val="single" w:sz="4" w:space="0" w:color="auto"/>
+        <w:left w:val="single" w:sz="4" w:space="0" w:color="auto"/>
+        <w:bottom w:val="single" w:sz="4" w:space="0" w:color="auto"/>
+        <w:right w:val="single" w:sz="4" w:space="0" w:color="auto"/>
+        <w:insideH w:val="single" w:sz="4" w:space="0" w:color="auto"/>
+        <w:insideV w:val="single" w:sz="4" w:space="0" w:color="auto"/>
       </w:tblBorders>
     </w:tblPr>
   </w:style>
-  <w:style w:type="character" w:customStyle="1" w:styleId="21">
+  <w:style w:type="character" w:customStyle="1" w:styleId="Ttulo1Char">
     <w:name w:val="Título 1 Char"/>
-    <w:basedOn w:val="11"/>
-    <w:link w:val="2"/>
+    <w:basedOn w:val="Fontepargpadro"/>
+    <w:link w:val="Ttulo1"/>
     <w:uiPriority w:val="9"/>
     <w:rPr>
-      <w:rFonts w:asciiTheme="majorHAnsi" w:hAnsiTheme="majorHAnsi" w:eastAsiaTheme="majorEastAsia" w:cstheme="majorBidi"/>
-      <w:color w:val="104862" w:themeColor="accent1" w:themeShade="BF"/>
+      <w:rFonts w:asciiTheme="majorHAnsi" w:eastAsiaTheme="majorEastAsia" w:hAnsiTheme="majorHAnsi" w:cstheme="majorBidi"/>
+      <w:color w:val="0F4761" w:themeColor="accent1" w:themeShade="BF"/>
       <w:sz w:val="40"/>
       <w:szCs w:val="40"/>
     </w:rPr>
   </w:style>
-  <w:style w:type="character" w:customStyle="1" w:styleId="22">
+  <w:style w:type="character" w:customStyle="1" w:styleId="Ttulo2Char">
     <w:name w:val="Título 2 Char"/>
-    <w:basedOn w:val="11"/>
-    <w:link w:val="3"/>
+    <w:basedOn w:val="Fontepargpadro"/>
+    <w:link w:val="Ttulo2"/>
+    <w:uiPriority w:val="9"/>
     <w:semiHidden/>
-    <w:uiPriority w:val="9"/>
-    <w:rPr>
-      <w:rFonts w:asciiTheme="majorHAnsi" w:hAnsiTheme="majorHAnsi" w:eastAsiaTheme="majorEastAsia" w:cstheme="majorBidi"/>
-      <w:color w:val="104862" w:themeColor="accent1" w:themeShade="BF"/>
+    <w:rPr>
+      <w:rFonts w:asciiTheme="majorHAnsi" w:eastAsiaTheme="majorEastAsia" w:hAnsiTheme="majorHAnsi" w:cstheme="majorBidi"/>
+      <w:color w:val="0F4761" w:themeColor="accent1" w:themeShade="BF"/>
       <w:sz w:val="32"/>
       <w:szCs w:val="32"/>
     </w:rPr>
   </w:style>
-  <w:style w:type="character" w:customStyle="1" w:styleId="23">
+  <w:style w:type="character" w:customStyle="1" w:styleId="Ttulo3Char">
     <w:name w:val="Título 3 Char"/>
-    <w:basedOn w:val="11"/>
-    <w:link w:val="4"/>
+    <w:basedOn w:val="Fontepargpadro"/>
+    <w:link w:val="Ttulo3"/>
+    <w:uiPriority w:val="9"/>
     <w:semiHidden/>
-    <w:uiPriority w:val="9"/>
     <w:rPr>
       <w:rFonts w:eastAsiaTheme="majorEastAsia" w:cstheme="majorBidi"/>
-      <w:color w:val="104862" w:themeColor="accent1" w:themeShade="BF"/>
+      <w:color w:val="0F4761" w:themeColor="accent1" w:themeShade="BF"/>
       <w:sz w:val="28"/>
       <w:szCs w:val="28"/>
     </w:rPr>
   </w:style>
-  <w:style w:type="character" w:customStyle="1" w:styleId="24">
+  <w:style w:type="character" w:customStyle="1" w:styleId="Ttulo4Char">
     <w:name w:val="Título 4 Char"/>
-    <w:basedOn w:val="11"/>
-    <w:link w:val="5"/>
+    <w:basedOn w:val="Fontepargpadro"/>
+    <w:link w:val="Ttulo4"/>
+    <w:uiPriority w:val="9"/>
     <w:semiHidden/>
     <w:qFormat/>
-    <w:uiPriority w:val="9"/>
     <w:rPr>
       <w:rFonts w:eastAsiaTheme="majorEastAsia" w:cstheme="majorBidi"/>
       <w:i/>
       <w:iCs/>
-      <w:color w:val="104862" w:themeColor="accent1" w:themeShade="BF"/>
-    </w:rPr>
-  </w:style>
-  <w:style w:type="character" w:customStyle="1" w:styleId="25">
+      <w:color w:val="0F4761" w:themeColor="accent1" w:themeShade="BF"/>
+    </w:rPr>
+  </w:style>
+  <w:style w:type="character" w:customStyle="1" w:styleId="Ttulo5Char">
     <w:name w:val="Título 5 Char"/>
-    <w:basedOn w:val="11"/>
-    <w:link w:val="6"/>
+    <w:basedOn w:val="Fontepargpadro"/>
+    <w:link w:val="Ttulo5"/>
+    <w:uiPriority w:val="9"/>
     <w:semiHidden/>
     <w:qFormat/>
+    <w:rPr>
+      <w:rFonts w:eastAsiaTheme="majorEastAsia" w:cstheme="majorBidi"/>
+      <w:color w:val="0F4761" w:themeColor="accent1" w:themeShade="BF"/>
+    </w:rPr>
+  </w:style>
+  <w:style w:type="character" w:customStyle="1" w:styleId="Ttulo6Char">
+    <w:name w:val="Título 6 Char"/>
+    <w:basedOn w:val="Fontepargpadro"/>
+    <w:link w:val="Ttulo6"/>
     <w:uiPriority w:val="9"/>
-    <w:rPr>
-      <w:rFonts w:eastAsiaTheme="majorEastAsia" w:cstheme="majorBidi"/>
-      <w:color w:val="104862" w:themeColor="accent1" w:themeShade="BF"/>
-    </w:rPr>
-  </w:style>
-  <w:style w:type="character" w:customStyle="1" w:styleId="26">
-    <w:name w:val="Título 6 Char"/>
-    <w:basedOn w:val="11"/>
-    <w:link w:val="7"/>
     <w:semiHidden/>
     <w:qFormat/>
-    <w:uiPriority w:val="9"/>
     <w:rPr>
       <w:rFonts w:eastAsiaTheme="majorEastAsia" w:cstheme="majorBidi"/>
       <w:i/>
       <w:iCs/>
       <w:color w:val="595959" w:themeColor="text1" w:themeTint="A6"/>
-      <w14:textFill>
-        <w14:solidFill>
-          <w14:schemeClr w14:val="tx1">
-            <w14:lumMod w14:val="65000"/>
-            <w14:lumOff w14:val="35000"/>
-          </w14:schemeClr>
-        </w14:solidFill>
-      </w14:textFill>
-    </w:rPr>
-  </w:style>
-  <w:style w:type="character" w:customStyle="1" w:styleId="27">
+    </w:rPr>
+  </w:style>
+  <w:style w:type="character" w:customStyle="1" w:styleId="Ttulo7Char">
     <w:name w:val="Título 7 Char"/>
-    <w:basedOn w:val="11"/>
-    <w:link w:val="8"/>
+    <w:basedOn w:val="Fontepargpadro"/>
+    <w:link w:val="Ttulo7"/>
+    <w:uiPriority w:val="9"/>
     <w:semiHidden/>
     <w:qFormat/>
-    <w:uiPriority w:val="9"/>
     <w:rPr>
       <w:rFonts w:eastAsiaTheme="majorEastAsia" w:cstheme="majorBidi"/>
       <w:color w:val="595959" w:themeColor="text1" w:themeTint="A6"/>
-      <w14:textFill>
-        <w14:solidFill>
-          <w14:schemeClr w14:val="tx1">
-            <w14:lumMod w14:val="65000"/>
-            <w14:lumOff w14:val="35000"/>
-          </w14:schemeClr>
-        </w14:solidFill>
-      </w14:textFill>
-    </w:rPr>
-  </w:style>
-  <w:style w:type="character" w:customStyle="1" w:styleId="28">
+    </w:rPr>
+  </w:style>
+  <w:style w:type="character" w:customStyle="1" w:styleId="Ttulo8Char">
     <w:name w:val="Título 8 Char"/>
-    <w:basedOn w:val="11"/>
-    <w:link w:val="9"/>
+    <w:basedOn w:val="Fontepargpadro"/>
+    <w:link w:val="Ttulo8"/>
+    <w:uiPriority w:val="9"/>
     <w:semiHidden/>
     <w:qFormat/>
-    <w:uiPriority w:val="9"/>
     <w:rPr>
       <w:rFonts w:eastAsiaTheme="majorEastAsia" w:cstheme="majorBidi"/>
       <w:i/>
       <w:iCs/>
       <w:color w:val="262626" w:themeColor="text1" w:themeTint="D9"/>
-      <w14:textFill>
-        <w14:solidFill>
-          <w14:schemeClr w14:val="tx1">
-            <w14:lumMod w14:val="85000"/>
-            <w14:lumOff w14:val="15000"/>
-          </w14:schemeClr>
-        </w14:solidFill>
-      </w14:textFill>
-    </w:rPr>
-  </w:style>
-  <w:style w:type="character" w:customStyle="1" w:styleId="29">
+    </w:rPr>
+  </w:style>
+  <w:style w:type="character" w:customStyle="1" w:styleId="Ttulo9Char">
     <w:name w:val="Título 9 Char"/>
-    <w:basedOn w:val="11"/>
-    <w:link w:val="10"/>
+    <w:basedOn w:val="Fontepargpadro"/>
+    <w:link w:val="Ttulo9"/>
+    <w:uiPriority w:val="9"/>
     <w:semiHidden/>
     <w:qFormat/>
-    <w:uiPriority w:val="9"/>
     <w:rPr>
       <w:rFonts w:eastAsiaTheme="majorEastAsia" w:cstheme="majorBidi"/>
       <w:color w:val="262626" w:themeColor="text1" w:themeTint="D9"/>
-      <w14:textFill>
-        <w14:solidFill>
-          <w14:schemeClr w14:val="tx1">
-            <w14:lumMod w14:val="85000"/>
-            <w14:lumOff w14:val="15000"/>
-          </w14:schemeClr>
-        </w14:solidFill>
-      </w14:textFill>
-    </w:rPr>
-  </w:style>
-  <w:style w:type="character" w:customStyle="1" w:styleId="30">
+    </w:rPr>
+  </w:style>
+  <w:style w:type="character" w:customStyle="1" w:styleId="TtuloChar">
     <w:name w:val="Título Char"/>
-    <w:basedOn w:val="11"/>
-    <w:link w:val="15"/>
-    <w:qFormat/>
+    <w:basedOn w:val="Fontepargpadro"/>
+    <w:link w:val="Ttulo"/>
     <w:uiPriority w:val="10"/>
-    <w:rPr>
-      <w:rFonts w:asciiTheme="majorHAnsi" w:hAnsiTheme="majorHAnsi" w:eastAsiaTheme="majorEastAsia" w:cstheme="majorBidi"/>
+    <w:qFormat/>
+    <w:rPr>
+      <w:rFonts w:asciiTheme="majorHAnsi" w:eastAsiaTheme="majorEastAsia" w:hAnsiTheme="majorHAnsi" w:cstheme="majorBidi"/>
       <w:spacing w:val="-10"/>
       <w:kern w:val="28"/>
       <w:sz w:val="56"/>
       <w:szCs w:val="56"/>
     </w:rPr>
   </w:style>
-  <w:style w:type="character" w:customStyle="1" w:styleId="31">
+  <w:style w:type="character" w:customStyle="1" w:styleId="SubttuloChar">
     <w:name w:val="Subtítulo Char"/>
-    <w:basedOn w:val="11"/>
-    <w:link w:val="19"/>
-    <w:qFormat/>
+    <w:basedOn w:val="Fontepargpadro"/>
+    <w:link w:val="Subttulo"/>
     <w:uiPriority w:val="11"/>
+    <w:qFormat/>
     <w:rPr>
       <w:rFonts w:eastAsiaTheme="majorEastAsia" w:cstheme="majorBidi"/>
       <w:color w:val="595959" w:themeColor="text1" w:themeTint="A6"/>
       <w:spacing w:val="15"/>
       <w:sz w:val="28"/>
       <w:szCs w:val="28"/>
-      <w14:textFill>
-        <w14:solidFill>
-          <w14:schemeClr w14:val="tx1">
-            <w14:lumMod w14:val="65000"/>
-            <w14:lumOff w14:val="35000"/>
-          </w14:schemeClr>
-        </w14:solidFill>
-      </w14:textFill>
-    </w:rPr>
-  </w:style>
-  <w:style w:type="paragraph" w:styleId="32">
+    </w:rPr>
+  </w:style>
+  <w:style w:type="paragraph" w:styleId="Citao">
     <w:name w:val="Quote"/>
-    <w:basedOn w:val="1"/>
-    <w:next w:val="1"/>
-    <w:link w:val="33"/>
-    <w:qFormat/>
+    <w:basedOn w:val="Normal"/>
+    <w:next w:val="Normal"/>
+    <w:link w:val="CitaoChar"/>
     <w:uiPriority w:val="29"/>
+    <w:qFormat/>
     <w:pPr>
       <w:spacing w:before="160"/>
       <w:jc w:val="center"/>
@@ -2554,68 +2532,52 @@
       <w:i/>
       <w:iCs/>
       <w:color w:val="404040" w:themeColor="text1" w:themeTint="BF"/>
-      <w14:textFill>
-        <w14:solidFill>
-          <w14:schemeClr w14:val="tx1">
-            <w14:lumMod w14:val="75000"/>
-            <w14:lumOff w14:val="25000"/>
-          </w14:schemeClr>
-        </w14:solidFill>
-      </w14:textFill>
-    </w:rPr>
-  </w:style>
-  <w:style w:type="character" w:customStyle="1" w:styleId="33">
+    </w:rPr>
+  </w:style>
+  <w:style w:type="character" w:customStyle="1" w:styleId="CitaoChar">
     <w:name w:val="Citação Char"/>
-    <w:basedOn w:val="11"/>
-    <w:link w:val="32"/>
-    <w:qFormat/>
+    <w:basedOn w:val="Fontepargpadro"/>
+    <w:link w:val="Citao"/>
     <w:uiPriority w:val="29"/>
+    <w:qFormat/>
     <w:rPr>
       <w:i/>
       <w:iCs/>
       <w:color w:val="404040" w:themeColor="text1" w:themeTint="BF"/>
-      <w14:textFill>
-        <w14:solidFill>
-          <w14:schemeClr w14:val="tx1">
-            <w14:lumMod w14:val="75000"/>
-            <w14:lumOff w14:val="25000"/>
-          </w14:schemeClr>
-        </w14:solidFill>
-      </w14:textFill>
-    </w:rPr>
-  </w:style>
-  <w:style w:type="paragraph" w:styleId="34">
+    </w:rPr>
+  </w:style>
+  <w:style w:type="paragraph" w:styleId="PargrafodaLista">
     <w:name w:val="List Paragraph"/>
-    <w:basedOn w:val="1"/>
-    <w:qFormat/>
+    <w:basedOn w:val="Normal"/>
     <w:uiPriority w:val="34"/>
+    <w:qFormat/>
     <w:pPr>
       <w:ind w:left="720"/>
       <w:contextualSpacing/>
     </w:pPr>
   </w:style>
-  <w:style w:type="character" w:customStyle="1" w:styleId="35">
-    <w:name w:val="Intense Emphasis"/>
-    <w:basedOn w:val="11"/>
-    <w:qFormat/>
+  <w:style w:type="character" w:customStyle="1" w:styleId="nfaseIntensa1">
+    <w:name w:val="Ênfase Intensa1"/>
+    <w:basedOn w:val="Fontepargpadro"/>
     <w:uiPriority w:val="21"/>
+    <w:qFormat/>
     <w:rPr>
       <w:i/>
       <w:iCs/>
-      <w:color w:val="104862" w:themeColor="accent1" w:themeShade="BF"/>
-    </w:rPr>
-  </w:style>
-  <w:style w:type="paragraph" w:styleId="36">
+      <w:color w:val="0F4761" w:themeColor="accent1" w:themeShade="BF"/>
+    </w:rPr>
+  </w:style>
+  <w:style w:type="paragraph" w:styleId="CitaoIntensa">
     <w:name w:val="Intense Quote"/>
-    <w:basedOn w:val="1"/>
-    <w:next w:val="1"/>
-    <w:link w:val="37"/>
-    <w:qFormat/>
+    <w:basedOn w:val="Normal"/>
+    <w:next w:val="Normal"/>
+    <w:link w:val="CitaoIntensaChar"/>
     <w:uiPriority w:val="30"/>
+    <w:qFormat/>
     <w:pPr>
       <w:pBdr>
-        <w:top w:val="single" w:color="0F4761" w:themeColor="accent1" w:themeShade="BF" w:sz="4" w:space="10"/>
-        <w:bottom w:val="single" w:color="0F4761" w:themeColor="accent1" w:themeShade="BF" w:sz="4" w:space="10"/>
+        <w:top w:val="single" w:sz="4" w:space="10" w:color="0F4761" w:themeColor="accent1" w:themeShade="BF"/>
+        <w:bottom w:val="single" w:sz="4" w:space="10" w:color="0F4761" w:themeColor="accent1" w:themeShade="BF"/>
       </w:pBdr>
       <w:spacing w:before="360" w:after="360"/>
       <w:ind w:left="864" w:right="864"/>
@@ -2624,47 +2586,47 @@
     <w:rPr>
       <w:i/>
       <w:iCs/>
-      <w:color w:val="104862" w:themeColor="accent1" w:themeShade="BF"/>
-    </w:rPr>
-  </w:style>
-  <w:style w:type="character" w:customStyle="1" w:styleId="37">
+      <w:color w:val="0F4761" w:themeColor="accent1" w:themeShade="BF"/>
+    </w:rPr>
+  </w:style>
+  <w:style w:type="character" w:customStyle="1" w:styleId="CitaoIntensaChar">
     <w:name w:val="Citação Intensa Char"/>
-    <w:basedOn w:val="11"/>
-    <w:link w:val="36"/>
-    <w:qFormat/>
+    <w:basedOn w:val="Fontepargpadro"/>
+    <w:link w:val="CitaoIntensa"/>
     <w:uiPriority w:val="30"/>
+    <w:qFormat/>
     <w:rPr>
       <w:i/>
       <w:iCs/>
-      <w:color w:val="104862" w:themeColor="accent1" w:themeShade="BF"/>
-    </w:rPr>
-  </w:style>
-  <w:style w:type="character" w:customStyle="1" w:styleId="38">
-    <w:name w:val="Intense Reference"/>
-    <w:basedOn w:val="11"/>
-    <w:qFormat/>
+      <w:color w:val="0F4761" w:themeColor="accent1" w:themeShade="BF"/>
+    </w:rPr>
+  </w:style>
+  <w:style w:type="character" w:customStyle="1" w:styleId="RefernciaIntensa1">
+    <w:name w:val="Referência Intensa1"/>
+    <w:basedOn w:val="Fontepargpadro"/>
     <w:uiPriority w:val="32"/>
+    <w:qFormat/>
     <w:rPr>
       <w:b/>
       <w:bCs/>
       <w:smallCaps/>
-      <w:color w:val="104862" w:themeColor="accent1" w:themeShade="BF"/>
+      <w:color w:val="0F4761" w:themeColor="accent1" w:themeShade="BF"/>
       <w:spacing w:val="5"/>
     </w:rPr>
   </w:style>
-  <w:style w:type="character" w:customStyle="1" w:styleId="39">
+  <w:style w:type="character" w:customStyle="1" w:styleId="CabealhoChar">
     <w:name w:val="Cabeçalho Char"/>
-    <w:basedOn w:val="11"/>
-    <w:link w:val="17"/>
-    <w:qFormat/>
+    <w:basedOn w:val="Fontepargpadro"/>
+    <w:link w:val="Cabealho"/>
     <w:uiPriority w:val="99"/>
-  </w:style>
-  <w:style w:type="character" w:customStyle="1" w:styleId="40">
+    <w:qFormat/>
+  </w:style>
+  <w:style w:type="character" w:customStyle="1" w:styleId="RodapChar">
     <w:name w:val="Rodapé Char"/>
-    <w:basedOn w:val="11"/>
-    <w:link w:val="18"/>
-    <w:qFormat/>
+    <w:basedOn w:val="Fontepargpadro"/>
+    <w:link w:val="Rodap"/>
     <w:uiPriority w:val="99"/>
+    <w:qFormat/>
   </w:style>
 </w:styles>
 </file>
@@ -2921,5 +2883,6 @@
     </a:fmtScheme>
   </a:themeElements>
   <a:objectDefaults/>
+  <a:extraClrSchemeLst/>
 </a:theme>
 </file>
</xml_diff>